<commit_message>
first working draft of software. all UX and IO is live and working, still working out bugs. documentation updated with architecture design viewpoint and dataflow viewpoint
</commit_message>
<xml_diff>
--- a/documentation/WMO_WVO_Refinery_SDD.docx
+++ b/documentation/WMO_WVO_Refinery_SDD.docx
@@ -17,6 +17,16 @@
           <w:highlight w:val="none"/>
         </w:rPr>
       </w:pPr>
+      <w:r>
+        <w:rPr>
+          <w:rFonts w:ascii="Arial" w:hAnsi="Arial" w:eastAsia="Arial" w:cs="Arial"/>
+          <w:b/>
+          <w:bCs/>
+          <w:sz w:val="32"/>
+          <w:szCs w:val="32"/>
+          <w:highlight w:val="none"/>
+        </w:rPr>
+      </w:r>
       <w:r>
         <w:rPr>
           <w:rFonts w:ascii="Arial" w:hAnsi="Arial" w:eastAsia="Arial" w:cs="Arial"/>
@@ -53,22 +63,6 @@
           <w:highlight w:val="none"/>
         </w:rPr>
       </w:r>
-    </w:p>
-    <w:p>
-      <w:pPr>
-        <w:pBdr/>
-        <w:spacing/>
-        <w:ind/>
-        <w:jc w:val="center"/>
-        <w:rPr>
-          <w:rFonts w:ascii="Arial" w:hAnsi="Arial" w:eastAsia="Arial" w:cs="Arial"/>
-          <w:b/>
-          <w:bCs/>
-          <w:sz w:val="32"/>
-          <w:szCs w:val="32"/>
-          <w:highlight w:val="none"/>
-        </w:rPr>
-      </w:pPr>
       <w:r>
         <w:rPr>
           <w:rFonts w:ascii="Arial" w:hAnsi="Arial" w:eastAsia="Arial" w:cs="Arial"/>
@@ -104,7 +98,53 @@
           <w:szCs w:val="32"/>
           <w:highlight w:val="none"/>
         </w:rPr>
+      </w:r>
+      <w:r>
+        <w:rPr>
+          <w:rFonts w:ascii="Arial" w:hAnsi="Arial" w:eastAsia="Arial" w:cs="Arial"/>
+          <w:b/>
+          <w:bCs/>
+          <w:sz w:val="32"/>
+          <w:szCs w:val="32"/>
+          <w:highlight w:val="none"/>
+        </w:rPr>
+      </w:r>
+    </w:p>
+    <w:p>
+      <w:pPr>
+        <w:pBdr/>
+        <w:spacing/>
+        <w:ind/>
+        <w:jc w:val="center"/>
+        <w:rPr>
+          <w:rFonts w:ascii="Arial" w:hAnsi="Arial" w:eastAsia="Arial" w:cs="Arial"/>
+          <w:b/>
+          <w:bCs/>
+          <w:sz w:val="32"/>
+          <w:szCs w:val="32"/>
+          <w:highlight w:val="none"/>
+        </w:rPr>
+      </w:pPr>
+      <w:r>
+        <w:rPr>
+          <w:rFonts w:ascii="Arial" w:hAnsi="Arial" w:eastAsia="Arial" w:cs="Arial"/>
+          <w:b/>
+          <w:bCs/>
+          <w:sz w:val="32"/>
+          <w:szCs w:val="32"/>
+          <w:highlight w:val="none"/>
+        </w:rPr>
         <w:t xml:space="preserve">Waste Motor Oil / Vegetable Oil Refinery</w:t>
+      </w:r>
+      <w:r>
+        <w:rPr>
+          <w:rFonts w:ascii="Arial" w:hAnsi="Arial" w:eastAsia="Arial" w:cs="Arial"/>
+          <w:b/>
+          <w:bCs/>
+          <w:sz w:val="32"/>
+          <w:szCs w:val="32"/>
+          <w:highlight w:val="none"/>
+        </w:rPr>
       </w:r>
     </w:p>
     <w:p>
@@ -130,66 +170,6 @@
         <w:t xml:space="preserve">This SDD Includes Interface and Electrical Design documentation. </w:t>
         <w:br/>
       </w:r>
-    </w:p>
-    <w:p>
-      <w:pPr>
-        <w:pBdr/>
-        <w:spacing/>
-        <w:ind/>
-        <w:jc w:val="center"/>
-        <w:rPr>
-          <w:rFonts w:ascii="Arial" w:hAnsi="Arial" w:eastAsia="Arial" w:cs="Arial"/>
-          <w:sz w:val="24"/>
-          <w:szCs w:val="24"/>
-          <w:highlight w:val="none"/>
-        </w:rPr>
-      </w:pPr>
-      <w:r>
-        <w:rPr>
-          <w:rFonts w:ascii="Arial" w:hAnsi="Arial" w:eastAsia="Arial" w:cs="Arial"/>
-          <w:sz w:val="24"/>
-          <w:szCs w:val="24"/>
-          <w:highlight w:val="none"/>
-        </w:rPr>
-        <w:t xml:space="preserve">Designed and built by: Corbin Probasco</w:t>
-      </w:r>
-    </w:p>
-    <w:p>
-      <w:pPr>
-        <w:pBdr/>
-        <w:spacing/>
-        <w:ind/>
-        <w:jc w:val="center"/>
-        <w:rPr>
-          <w:rFonts w:ascii="Arial" w:hAnsi="Arial" w:eastAsia="Arial" w:cs="Arial"/>
-          <w:sz w:val="24"/>
-          <w:szCs w:val="24"/>
-          <w:highlight w:val="none"/>
-        </w:rPr>
-      </w:pPr>
-      <w:r>
-        <w:rPr>
-          <w:rFonts w:ascii="Arial" w:hAnsi="Arial" w:eastAsia="Arial" w:cs="Arial"/>
-          <w:sz w:val="24"/>
-          <w:szCs w:val="24"/>
-          <w:highlight w:val="none"/>
-        </w:rPr>
-        <w:t xml:space="preserve">August 2026</w:t>
-      </w:r>
-    </w:p>
-    <w:p>
-      <w:pPr>
-        <w:pBdr/>
-        <w:spacing/>
-        <w:ind/>
-        <w:jc w:val="center"/>
-        <w:rPr>
-          <w:rFonts w:ascii="Arial" w:hAnsi="Arial" w:eastAsia="Arial" w:cs="Arial"/>
-          <w:sz w:val="24"/>
-          <w:szCs w:val="24"/>
-          <w:highlight w:val="none"/>
-        </w:rPr>
-      </w:pPr>
       <w:r>
         <w:rPr>
           <w:rFonts w:ascii="Arial" w:hAnsi="Arial" w:eastAsia="Arial" w:cs="Arial"/>
@@ -219,7 +199,107 @@
           <w:szCs w:val="24"/>
           <w:highlight w:val="none"/>
         </w:rPr>
+        <w:t xml:space="preserve">Designed and built by: Corbin Probasco</w:t>
+      </w:r>
+      <w:r>
+        <w:rPr>
+          <w:rFonts w:ascii="Arial" w:hAnsi="Arial" w:eastAsia="Arial" w:cs="Arial"/>
+          <w:sz w:val="24"/>
+          <w:szCs w:val="24"/>
+          <w:highlight w:val="none"/>
+        </w:rPr>
+      </w:r>
+    </w:p>
+    <w:p>
+      <w:pPr>
+        <w:pBdr/>
+        <w:spacing/>
+        <w:ind/>
+        <w:jc w:val="center"/>
+        <w:rPr>
+          <w:rFonts w:ascii="Arial" w:hAnsi="Arial" w:eastAsia="Arial" w:cs="Arial"/>
+          <w:sz w:val="24"/>
+          <w:szCs w:val="24"/>
+          <w:highlight w:val="none"/>
+        </w:rPr>
+      </w:pPr>
+      <w:r>
+        <w:rPr>
+          <w:rFonts w:ascii="Arial" w:hAnsi="Arial" w:eastAsia="Arial" w:cs="Arial"/>
+          <w:sz w:val="24"/>
+          <w:szCs w:val="24"/>
+          <w:highlight w:val="none"/>
+        </w:rPr>
+        <w:t xml:space="preserve">August 2026</w:t>
+      </w:r>
+      <w:r>
+        <w:rPr>
+          <w:rFonts w:ascii="Arial" w:hAnsi="Arial" w:eastAsia="Arial" w:cs="Arial"/>
+          <w:sz w:val="24"/>
+          <w:szCs w:val="24"/>
+          <w:highlight w:val="none"/>
+        </w:rPr>
+      </w:r>
+    </w:p>
+    <w:p>
+      <w:pPr>
+        <w:pBdr/>
+        <w:spacing/>
+        <w:ind/>
+        <w:jc w:val="center"/>
+        <w:rPr>
+          <w:rFonts w:ascii="Arial" w:hAnsi="Arial" w:eastAsia="Arial" w:cs="Arial"/>
+          <w:sz w:val="24"/>
+          <w:szCs w:val="24"/>
+          <w:highlight w:val="none"/>
+        </w:rPr>
+      </w:pPr>
+      <w:r>
+        <w:rPr>
+          <w:rFonts w:ascii="Arial" w:hAnsi="Arial" w:eastAsia="Arial" w:cs="Arial"/>
+          <w:sz w:val="24"/>
+          <w:szCs w:val="24"/>
+          <w:highlight w:val="none"/>
+        </w:rPr>
+      </w:r>
+      <w:r>
+        <w:rPr>
+          <w:rFonts w:ascii="Arial" w:hAnsi="Arial" w:eastAsia="Arial" w:cs="Arial"/>
+          <w:sz w:val="24"/>
+          <w:szCs w:val="24"/>
+          <w:highlight w:val="none"/>
+        </w:rPr>
+      </w:r>
+    </w:p>
+    <w:p>
+      <w:pPr>
+        <w:pBdr/>
+        <w:spacing/>
+        <w:ind/>
+        <w:jc w:val="center"/>
+        <w:rPr>
+          <w:rFonts w:ascii="Arial" w:hAnsi="Arial" w:eastAsia="Arial" w:cs="Arial"/>
+          <w:sz w:val="24"/>
+          <w:szCs w:val="24"/>
+          <w:highlight w:val="none"/>
+        </w:rPr>
+      </w:pPr>
+      <w:r>
+        <w:rPr>
+          <w:rFonts w:ascii="Arial" w:hAnsi="Arial" w:eastAsia="Arial" w:cs="Arial"/>
+          <w:sz w:val="24"/>
+          <w:szCs w:val="24"/>
+          <w:highlight w:val="none"/>
+        </w:rPr>
         <w:br w:type="page" w:clear="all"/>
+      </w:r>
+      <w:r>
+        <w:rPr>
+          <w:rFonts w:ascii="Arial" w:hAnsi="Arial" w:eastAsia="Arial" w:cs="Arial"/>
+          <w:sz w:val="24"/>
+          <w:szCs w:val="24"/>
+          <w:highlight w:val="none"/>
+        </w:rPr>
       </w:r>
     </w:p>
     <w:p>
@@ -255,6 +335,16 @@
           <w:highlight w:val="none"/>
         </w:rPr>
         <w:t xml:space="preserve">Temp sensors (10K NTC3950)</w:t>
+      </w:r>
+      <w:r>
+        <w:rPr>
+          <w:rFonts w:ascii="Arial" w:hAnsi="Arial" w:eastAsia="Arial" w:cs="Arial"/>
+          <w:b/>
+          <w:bCs/>
+          <w:sz w:val="28"/>
+          <w:szCs w:val="28"/>
+          <w:highlight w:val="none"/>
+        </w:rPr>
       </w:r>
     </w:p>
     <w:p>
@@ -350,7 +440,24 @@
         </w:rPr>
       </w:pPr>
       <w:r>
-        <w:t xml:space="preserve">10K NTC3950 thermistor, resistance table computed from the Beta equation (R = R25 x exp(B x (1/T - 1/T25)), R25=10000 ohm, B=3950). ADC raw column assumes the divider 3.3V -&gt; thermistor -&gt; ADC pin -&gt; 10k fixed resistor -&gt; GND, 12-bit ADC (0-4095). Note the 25C row lands at exactly half-scale (2048), confirming the 10k fixed resistor is well matched to this thermistor. ADC reading rises as temperature rises with this wiring orientation, matching the level sender's convention below (higher ADC = more of what's being measured). Three identical dividers are used, one per probe (Tank 1 Temp on A0/PA0, Tank 2 Temp on A1/PA1, Nozzle Temp on A2/PA4). Each probe has one lead on the shared 3.3V rail and the other lead on its own 10k fixed resistor (R3, R4, R5); the ADC pin taps the node between the probe and its resistor, and the far ends of all three resistors join at the common ground. The fixed resistors are 10k +/-5% (the NTC3950 probes are 1%), so expect roughly 1-2 C of reading error at room temperature unless the actual resistor values are measured and used in firmware.</w:t>
+        <w:t xml:space="preserve">10K NTC3950 thermistor, resistance table computed from the </w:t>
+      </w:r>
+      <w:r>
+        <w:t xml:space="preserve">Beta equation (R = R25 x exp(B x (1/T - 1/T25)), R25=10000 ohm, B=3950). ADC raw column assumes the divider 3.3V -&gt; thermistor -&gt; ADC pin -&gt; 10k fixed resistor -&gt; GND, 12-bit ADC (0-4095). Note the 25C row lands at exactly half-scale (2048), confirming the</w:t>
+      </w:r>
+      <w:r>
+        <w:t xml:space="preserve"> 10k fixed resistor is well matched to this thermistor. ADC reading rises as temperature rises with this wiring orientation, matching the level sender's convention below (higher ADC = more of what's being measured). Three identical dividers are used, one p</w:t>
+      </w:r>
+      <w:r>
+        <w:t xml:space="preserve">er probe (Tank 1 Temp on A0/PA0, Tank 2 Temp on A1/PA1, Nozzle Temp on A2/PA4). Each probe has one lead on the shared 3.3V rail and the other lead on its own 10k fixed resistor (R3, R4, R5); the ADC pin taps the node between the probe and its resistor, and</w:t>
+      </w:r>
+      <w:r>
+        <w:t xml:space="preserve"> the far ends of all three resistors join at the common ground. The fixed resistors are 10k +/-5% (the NTC3950 probes are 1%), so expect roughly 1-2 C of reading error at room temperature unless the actual resistor values are measured and used in firmware.</w:t>
+      </w:r>
+      <w:r>
+        <w:rPr>
+          <w:highlight w:val="none"/>
+        </w:rPr>
       </w:r>
       <w:r>
         <w:rPr>
@@ -484,6 +591,7 @@
             <w:r>
               <w:t xml:space="preserve">-10</w:t>
             </w:r>
+            <w:r/>
           </w:p>
         </w:tc>
         <w:tc>
@@ -502,6 +610,7 @@
             <w:r>
               <w:t xml:space="preserve">14</w:t>
             </w:r>
+            <w:r/>
           </w:p>
         </w:tc>
         <w:tc>
@@ -520,6 +629,7 @@
             <w:r>
               <w:t xml:space="preserve">58380</w:t>
             </w:r>
+            <w:r/>
           </w:p>
         </w:tc>
         <w:tc>
@@ -538,6 +648,7 @@
             <w:r>
               <w:t xml:space="preserve">600</w:t>
             </w:r>
+            <w:r/>
           </w:p>
         </w:tc>
       </w:tr>
@@ -559,6 +670,7 @@
             <w:r>
               <w:t xml:space="preserve">-5</w:t>
             </w:r>
+            <w:r/>
           </w:p>
         </w:tc>
         <w:tc>
@@ -577,6 +689,7 @@
             <w:r>
               <w:t xml:space="preserve">23</w:t>
             </w:r>
+            <w:r/>
           </w:p>
         </w:tc>
         <w:tc>
@@ -595,6 +708,7 @@
             <w:r>
               <w:t xml:space="preserve">44040</w:t>
             </w:r>
+            <w:r/>
           </w:p>
         </w:tc>
         <w:tc>
@@ -613,6 +727,7 @@
             <w:r>
               <w:t xml:space="preserve">757</w:t>
             </w:r>
+            <w:r/>
           </w:p>
         </w:tc>
       </w:tr>
@@ -634,6 +749,7 @@
             <w:r>
               <w:t xml:space="preserve">0</w:t>
             </w:r>
+            <w:r/>
           </w:p>
         </w:tc>
         <w:tc>
@@ -652,6 +768,7 @@
             <w:r>
               <w:t xml:space="preserve">32</w:t>
             </w:r>
+            <w:r/>
           </w:p>
         </w:tc>
         <w:tc>
@@ -670,6 +787,7 @@
             <w:r>
               <w:t xml:space="preserve">33530</w:t>
             </w:r>
+            <w:r/>
           </w:p>
         </w:tc>
         <w:tc>
@@ -688,6 +806,7 @@
             <w:r>
               <w:t xml:space="preserve">940</w:t>
             </w:r>
+            <w:r/>
           </w:p>
         </w:tc>
       </w:tr>
@@ -709,6 +828,7 @@
             <w:r>
               <w:t xml:space="preserve">5</w:t>
             </w:r>
+            <w:r/>
           </w:p>
         </w:tc>
         <w:tc>
@@ -727,6 +847,7 @@
             <w:r>
               <w:t xml:space="preserve">41</w:t>
             </w:r>
+            <w:r/>
           </w:p>
         </w:tc>
         <w:tc>
@@ -745,6 +866,7 @@
             <w:r>
               <w:t xml:space="preserve">25940</w:t>
             </w:r>
+            <w:r/>
           </w:p>
         </w:tc>
         <w:tc>
@@ -763,6 +885,7 @@
             <w:r>
               <w:t xml:space="preserve">1139</w:t>
             </w:r>
+            <w:r/>
           </w:p>
         </w:tc>
       </w:tr>
@@ -784,6 +907,7 @@
             <w:r>
               <w:t xml:space="preserve">10</w:t>
             </w:r>
+            <w:r/>
           </w:p>
         </w:tc>
         <w:tc>
@@ -802,6 +926,7 @@
             <w:r>
               <w:t xml:space="preserve">50</w:t>
             </w:r>
+            <w:r/>
           </w:p>
         </w:tc>
         <w:tc>
@@ -820,6 +945,7 @@
             <w:r>
               <w:t xml:space="preserve">20176</w:t>
             </w:r>
+            <w:r/>
           </w:p>
         </w:tc>
         <w:tc>
@@ -838,6 +964,7 @@
             <w:r>
               <w:t xml:space="preserve">1357</w:t>
             </w:r>
+            <w:r/>
           </w:p>
         </w:tc>
       </w:tr>
@@ -859,6 +986,7 @@
             <w:r>
               <w:t xml:space="preserve">15</w:t>
             </w:r>
+            <w:r/>
           </w:p>
         </w:tc>
         <w:tc>
@@ -877,6 +1005,7 @@
             <w:r>
               <w:t xml:space="preserve">59</w:t>
             </w:r>
+            <w:r/>
           </w:p>
         </w:tc>
         <w:tc>
@@ -895,6 +1024,7 @@
             <w:r>
               <w:t xml:space="preserve">15838</w:t>
             </w:r>
+            <w:r/>
           </w:p>
         </w:tc>
         <w:tc>
@@ -913,6 +1043,7 @@
             <w:r>
               <w:t xml:space="preserve">1585</w:t>
             </w:r>
+            <w:r/>
           </w:p>
         </w:tc>
       </w:tr>
@@ -934,6 +1065,7 @@
             <w:r>
               <w:t xml:space="preserve">20</w:t>
             </w:r>
+            <w:r/>
           </w:p>
         </w:tc>
         <w:tc>
@@ -952,6 +1084,7 @@
             <w:r>
               <w:t xml:space="preserve">68</w:t>
             </w:r>
+            <w:r/>
           </w:p>
         </w:tc>
         <w:tc>
@@ -970,6 +1103,7 @@
             <w:r>
               <w:t xml:space="preserve">12540</w:t>
             </w:r>
+            <w:r/>
           </w:p>
         </w:tc>
         <w:tc>
@@ -988,6 +1122,7 @@
             <w:r>
               <w:t xml:space="preserve">1817</w:t>
             </w:r>
+            <w:r/>
           </w:p>
         </w:tc>
       </w:tr>
@@ -1009,6 +1144,7 @@
             <w:r>
               <w:t xml:space="preserve">25</w:t>
             </w:r>
+            <w:r/>
           </w:p>
         </w:tc>
         <w:tc>
@@ -1027,6 +1163,7 @@
             <w:r>
               <w:t xml:space="preserve">77</w:t>
             </w:r>
+            <w:r/>
           </w:p>
         </w:tc>
         <w:tc>
@@ -1045,6 +1182,7 @@
             <w:r>
               <w:t xml:space="preserve">10000</w:t>
             </w:r>
+            <w:r/>
           </w:p>
         </w:tc>
         <w:tc>
@@ -1063,6 +1201,7 @@
             <w:r>
               <w:t xml:space="preserve">2047</w:t>
             </w:r>
+            <w:r/>
           </w:p>
         </w:tc>
       </w:tr>
@@ -1084,6 +1223,7 @@
             <w:r>
               <w:t xml:space="preserve">30</w:t>
             </w:r>
+            <w:r/>
           </w:p>
         </w:tc>
         <w:tc>
@@ -1102,6 +1242,7 @@
             <w:r>
               <w:t xml:space="preserve">86</w:t>
             </w:r>
+            <w:r/>
           </w:p>
         </w:tc>
         <w:tc>
@@ -1120,6 +1261,7 @@
             <w:r>
               <w:t xml:space="preserve">8041</w:t>
             </w:r>
+            <w:r/>
           </w:p>
         </w:tc>
         <w:tc>
@@ -1138,6 +1280,7 @@
             <w:r>
               <w:t xml:space="preserve">2270</w:t>
             </w:r>
+            <w:r/>
           </w:p>
         </w:tc>
       </w:tr>
@@ -1159,6 +1302,7 @@
             <w:r>
               <w:t xml:space="preserve">35</w:t>
             </w:r>
+            <w:r/>
           </w:p>
         </w:tc>
         <w:tc>
@@ -1177,6 +1321,7 @@
             <w:r>
               <w:t xml:space="preserve">95</w:t>
             </w:r>
+            <w:r/>
           </w:p>
         </w:tc>
         <w:tc>
@@ -1195,6 +1340,7 @@
             <w:r>
               <w:t xml:space="preserve">6505</w:t>
             </w:r>
+            <w:r/>
           </w:p>
         </w:tc>
         <w:tc>
@@ -1213,6 +1359,7 @@
             <w:r>
               <w:t xml:space="preserve">2481</w:t>
             </w:r>
+            <w:r/>
           </w:p>
         </w:tc>
       </w:tr>
@@ -1234,6 +1381,7 @@
             <w:r>
               <w:t xml:space="preserve">40</w:t>
             </w:r>
+            <w:r/>
           </w:p>
         </w:tc>
         <w:tc>
@@ -1252,6 +1400,7 @@
             <w:r>
               <w:t xml:space="preserve">104</w:t>
             </w:r>
+            <w:r/>
           </w:p>
         </w:tc>
         <w:tc>
@@ -1270,6 +1419,7 @@
             <w:r>
               <w:t xml:space="preserve">5301</w:t>
             </w:r>
+            <w:r/>
           </w:p>
         </w:tc>
         <w:tc>
@@ -1288,6 +1438,7 @@
             <w:r>
               <w:t xml:space="preserve">2676</w:t>
             </w:r>
+            <w:r/>
           </w:p>
         </w:tc>
       </w:tr>
@@ -1309,6 +1460,7 @@
             <w:r>
               <w:t xml:space="preserve">45</w:t>
             </w:r>
+            <w:r/>
           </w:p>
         </w:tc>
         <w:tc>
@@ -1327,6 +1479,7 @@
             <w:r>
               <w:t xml:space="preserve">113</w:t>
             </w:r>
+            <w:r/>
           </w:p>
         </w:tc>
         <w:tc>
@@ -1345,6 +1498,7 @@
             <w:r>
               <w:t xml:space="preserve">4349</w:t>
             </w:r>
+            <w:r/>
           </w:p>
         </w:tc>
         <w:tc>
@@ -1363,6 +1517,7 @@
             <w:r>
               <w:t xml:space="preserve">2854</w:t>
             </w:r>
+            <w:r/>
           </w:p>
         </w:tc>
       </w:tr>
@@ -1384,6 +1539,7 @@
             <w:r>
               <w:t xml:space="preserve">50</w:t>
             </w:r>
+            <w:r/>
           </w:p>
         </w:tc>
         <w:tc>
@@ -1402,6 +1558,7 @@
             <w:r>
               <w:t xml:space="preserve">122</w:t>
             </w:r>
+            <w:r/>
           </w:p>
         </w:tc>
         <w:tc>
@@ -1420,6 +1577,7 @@
             <w:r>
               <w:t xml:space="preserve">3588</w:t>
             </w:r>
+            <w:r/>
           </w:p>
         </w:tc>
         <w:tc>
@@ -1438,6 +1596,7 @@
             <w:r>
               <w:t xml:space="preserve">3014</w:t>
             </w:r>
+            <w:r/>
           </w:p>
         </w:tc>
       </w:tr>
@@ -1459,6 +1618,7 @@
             <w:r>
               <w:t xml:space="preserve">55</w:t>
             </w:r>
+            <w:r/>
           </w:p>
         </w:tc>
         <w:tc>
@@ -1477,6 +1637,7 @@
             <w:r>
               <w:t xml:space="preserve">131</w:t>
             </w:r>
+            <w:r/>
           </w:p>
         </w:tc>
         <w:tc>
@@ -1495,6 +1656,7 @@
             <w:r>
               <w:t xml:space="preserve">2979</w:t>
             </w:r>
+            <w:r/>
           </w:p>
         </w:tc>
         <w:tc>
@@ -1513,6 +1675,7 @@
             <w:r>
               <w:t xml:space="preserve">3155</w:t>
             </w:r>
+            <w:r/>
           </w:p>
         </w:tc>
       </w:tr>
@@ -1534,6 +1697,7 @@
             <w:r>
               <w:t xml:space="preserve">60</w:t>
             </w:r>
+            <w:r/>
           </w:p>
         </w:tc>
         <w:tc>
@@ -1552,6 +1716,7 @@
             <w:r>
               <w:t xml:space="preserve">140</w:t>
             </w:r>
+            <w:r/>
           </w:p>
         </w:tc>
         <w:tc>
@@ -1570,6 +1735,7 @@
             <w:r>
               <w:t xml:space="preserve">2487</w:t>
             </w:r>
+            <w:r/>
           </w:p>
         </w:tc>
         <w:tc>
@@ -1588,6 +1754,7 @@
             <w:r>
               <w:t xml:space="preserve">3279</w:t>
             </w:r>
+            <w:r/>
           </w:p>
         </w:tc>
       </w:tr>
@@ -1609,6 +1776,7 @@
             <w:r>
               <w:t xml:space="preserve">65</w:t>
             </w:r>
+            <w:r/>
           </w:p>
         </w:tc>
         <w:tc>
@@ -1627,6 +1795,7 @@
             <w:r>
               <w:t xml:space="preserve">149</w:t>
             </w:r>
+            <w:r/>
           </w:p>
         </w:tc>
         <w:tc>
@@ -1645,6 +1814,7 @@
             <w:r>
               <w:t xml:space="preserve">2088</w:t>
             </w:r>
+            <w:r/>
           </w:p>
         </w:tc>
         <w:tc>
@@ -1663,6 +1833,7 @@
             <w:r>
               <w:t xml:space="preserve">3388</w:t>
             </w:r>
+            <w:r/>
           </w:p>
         </w:tc>
       </w:tr>
@@ -1684,6 +1855,7 @@
             <w:r>
               <w:t xml:space="preserve">70</w:t>
             </w:r>
+            <w:r/>
           </w:p>
         </w:tc>
         <w:tc>
@@ -1702,6 +1874,7 @@
             <w:r>
               <w:t xml:space="preserve">158</w:t>
             </w:r>
+            <w:r/>
           </w:p>
         </w:tc>
         <w:tc>
@@ -1720,6 +1893,7 @@
             <w:r>
               <w:t xml:space="preserve">1762</w:t>
             </w:r>
+            <w:r/>
           </w:p>
         </w:tc>
         <w:tc>
@@ -1738,6 +1912,7 @@
             <w:r>
               <w:t xml:space="preserve">3482</w:t>
             </w:r>
+            <w:r/>
           </w:p>
         </w:tc>
       </w:tr>
@@ -1759,6 +1934,7 @@
             <w:r>
               <w:t xml:space="preserve">75</w:t>
             </w:r>
+            <w:r/>
           </w:p>
         </w:tc>
         <w:tc>
@@ -1777,6 +1953,7 @@
             <w:r>
               <w:t xml:space="preserve">167</w:t>
             </w:r>
+            <w:r/>
           </w:p>
         </w:tc>
         <w:tc>
@@ -1795,6 +1972,7 @@
             <w:r>
               <w:t xml:space="preserve">1493</w:t>
             </w:r>
+            <w:r/>
           </w:p>
         </w:tc>
         <w:tc>
@@ -1813,6 +1991,7 @@
             <w:r>
               <w:t xml:space="preserve">3563</w:t>
             </w:r>
+            <w:r/>
           </w:p>
         </w:tc>
       </w:tr>
@@ -1834,6 +2013,7 @@
             <w:r>
               <w:t xml:space="preserve">80</w:t>
             </w:r>
+            <w:r/>
           </w:p>
         </w:tc>
         <w:tc>
@@ -1852,6 +2032,7 @@
             <w:r>
               <w:t xml:space="preserve">176</w:t>
             </w:r>
+            <w:r/>
           </w:p>
         </w:tc>
         <w:tc>
@@ -1870,6 +2051,7 @@
             <w:r>
               <w:t xml:space="preserve">1271</w:t>
             </w:r>
+            <w:r/>
           </w:p>
         </w:tc>
         <w:tc>
@@ -1888,6 +2070,7 @@
             <w:r>
               <w:t xml:space="preserve">3633</w:t>
             </w:r>
+            <w:r/>
           </w:p>
         </w:tc>
       </w:tr>
@@ -1909,6 +2092,7 @@
             <w:r>
               <w:t xml:space="preserve">85</w:t>
             </w:r>
+            <w:r/>
           </w:p>
         </w:tc>
         <w:tc>
@@ -1927,6 +2111,7 @@
             <w:r>
               <w:t xml:space="preserve">185</w:t>
             </w:r>
+            <w:r/>
           </w:p>
         </w:tc>
         <w:tc>
@@ -1945,6 +2130,7 @@
             <w:r>
               <w:t xml:space="preserve">1087</w:t>
             </w:r>
+            <w:r/>
           </w:p>
         </w:tc>
         <w:tc>
@@ -1963,6 +2149,7 @@
             <w:r>
               <w:t xml:space="preserve">3694</w:t>
             </w:r>
+            <w:r/>
           </w:p>
         </w:tc>
       </w:tr>
@@ -1984,6 +2171,7 @@
             <w:r>
               <w:t xml:space="preserve">90</w:t>
             </w:r>
+            <w:r/>
           </w:p>
         </w:tc>
         <w:tc>
@@ -2002,6 +2190,7 @@
             <w:r>
               <w:t xml:space="preserve">194</w:t>
             </w:r>
+            <w:r/>
           </w:p>
         </w:tc>
         <w:tc>
@@ -2020,6 +2209,7 @@
             <w:r>
               <w:t xml:space="preserve">934</w:t>
             </w:r>
+            <w:r/>
           </w:p>
         </w:tc>
         <w:tc>
@@ -2038,6 +2228,7 @@
             <w:r>
               <w:t xml:space="preserve">3745</w:t>
             </w:r>
+            <w:r/>
           </w:p>
         </w:tc>
       </w:tr>
@@ -2059,6 +2250,7 @@
             <w:r>
               <w:t xml:space="preserve">95</w:t>
             </w:r>
+            <w:r/>
           </w:p>
         </w:tc>
         <w:tc>
@@ -2077,6 +2269,7 @@
             <w:r>
               <w:t xml:space="preserve">203</w:t>
             </w:r>
+            <w:r/>
           </w:p>
         </w:tc>
         <w:tc>
@@ -2095,6 +2288,7 @@
             <w:r>
               <w:t xml:space="preserve">805</w:t>
             </w:r>
+            <w:r/>
           </w:p>
         </w:tc>
         <w:tc>
@@ -2113,6 +2307,7 @@
             <w:r>
               <w:t xml:space="preserve">3790</w:t>
             </w:r>
+            <w:r/>
           </w:p>
         </w:tc>
       </w:tr>
@@ -2134,6 +2329,7 @@
             <w:r>
               <w:t xml:space="preserve">100</w:t>
             </w:r>
+            <w:r/>
           </w:p>
         </w:tc>
         <w:tc>
@@ -2152,6 +2348,7 @@
             <w:r>
               <w:t xml:space="preserve">212</w:t>
             </w:r>
+            <w:r/>
           </w:p>
         </w:tc>
         <w:tc>
@@ -2170,6 +2367,7 @@
             <w:r>
               <w:t xml:space="preserve">698</w:t>
             </w:r>
+            <w:r/>
           </w:p>
         </w:tc>
         <w:tc>
@@ -2188,6 +2386,7 @@
             <w:r>
               <w:t xml:space="preserve">3828</w:t>
             </w:r>
+            <w:r/>
           </w:p>
         </w:tc>
       </w:tr>
@@ -2224,6 +2423,16 @@
           <w:highlight w:val="none"/>
         </w:rPr>
       </w:r>
+      <w:r>
+        <w:rPr>
+          <w:rFonts w:ascii="Arial" w:hAnsi="Arial" w:eastAsia="Arial" w:cs="Arial"/>
+          <w:b/>
+          <w:bCs/>
+          <w:sz w:val="24"/>
+          <w:szCs w:val="24"/>
+          <w:highlight w:val="none"/>
+        </w:rPr>
+      </w:r>
     </w:p>
     <w:p>
       <w:pPr>
@@ -2238,6 +2447,14 @@
           <w:highlight w:val="none"/>
         </w:rPr>
       </w:pPr>
+      <w:r>
+        <w:rPr>
+          <w:rFonts w:ascii="Arial" w:hAnsi="Arial" w:eastAsia="Arial" w:cs="Arial"/>
+          <w:sz w:val="24"/>
+          <w:szCs w:val="24"/>
+          <w:highlight w:val="none"/>
+        </w:rPr>
+      </w:r>
       <w:r>
         <w:rPr>
           <w:rFonts w:ascii="Arial" w:hAnsi="Arial" w:eastAsia="Arial" w:cs="Arial"/>
@@ -2266,6 +2483,15 @@
           <w:sz w:val="32"/>
         </w:rPr>
         <w:t xml:space="preserve">Tank Level Sensors</w:t>
+      </w:r>
+      <w:r>
+        <w:rPr>
+          <w:b/>
+          <w:bCs/>
+          <w:sz w:val="32"/>
+          <w:szCs w:val="32"/>
+          <w:highlight w:val="none"/>
+        </w:rPr>
       </w:r>
       <w:r>
         <w:rPr>
@@ -2368,8 +2594,15 @@
         <w:rPr/>
       </w:pPr>
       <w:r>
-        <w:t xml:space="preserve">Marine reed/float level sender, American/SAE standard, measured 240 ohm empty (float down) to 33 ohm full (float up). Divider uses a 100 ohm fixed resistor: 3.3V -&gt; sender -&gt; ADC pin -&gt; 100 ohm -&gt; GND. With this wiring orientation ADC reading rises as the tank fills. Table assumes resistance varies linearly with float position across the sender's travel; this is the standard assumption for this type of sender but has not been verified against the physical unit, calibrate against known fill levels before trusting absolute values. 12-bit ADC (0-4095).</w:t>
+        <w:t xml:space="preserve">Marine reed/float level sender, American/SA</w:t>
       </w:r>
+      <w:r>
+        <w:t xml:space="preserve">E standard, measured 240 ohm empty (float down) to 33 ohm full (float up). Divider uses a 100 ohm fixed resistor: 3.3V -&gt; sender -&gt; ADC pin -&gt; 100 ohm -&gt; GND. With this wiring orientation ADC reading rises as the tank fills. Table assumes resistance varies</w:t>
+      </w:r>
+      <w:r>
+        <w:t xml:space="preserve"> linearly with float position across the sender's travel; this is the standard assumption for this type of sender but has not been verified against the physical unit, calibrate against known fill levels before trusting absolute values. 12-bit ADC (0-4095).</w:t>
+      </w:r>
+      <w:r/>
     </w:p>
     <w:tbl>
       <w:tblPr>
@@ -2473,6 +2706,7 @@
             <w:r>
               <w:t xml:space="preserve">0</w:t>
             </w:r>
+            <w:r/>
           </w:p>
         </w:tc>
         <w:tc>
@@ -2491,6 +2725,7 @@
             <w:r>
               <w:t xml:space="preserve">240.0</w:t>
             </w:r>
+            <w:r/>
           </w:p>
         </w:tc>
         <w:tc>
@@ -2509,6 +2744,7 @@
             <w:r>
               <w:t xml:space="preserve">1204</w:t>
             </w:r>
+            <w:r/>
           </w:p>
         </w:tc>
       </w:tr>
@@ -2530,6 +2766,7 @@
             <w:r>
               <w:t xml:space="preserve">10</w:t>
             </w:r>
+            <w:r/>
           </w:p>
         </w:tc>
         <w:tc>
@@ -2548,6 +2785,7 @@
             <w:r>
               <w:t xml:space="preserve">219.3</w:t>
             </w:r>
+            <w:r/>
           </w:p>
         </w:tc>
         <w:tc>
@@ -2566,6 +2804,7 @@
             <w:r>
               <w:t xml:space="preserve">1282</w:t>
             </w:r>
+            <w:r/>
           </w:p>
         </w:tc>
       </w:tr>
@@ -2587,6 +2826,7 @@
             <w:r>
               <w:t xml:space="preserve">20</w:t>
             </w:r>
+            <w:r/>
           </w:p>
         </w:tc>
         <w:tc>
@@ -2605,6 +2845,7 @@
             <w:r>
               <w:t xml:space="preserve">198.6</w:t>
             </w:r>
+            <w:r/>
           </w:p>
         </w:tc>
         <w:tc>
@@ -2623,6 +2864,7 @@
             <w:r>
               <w:t xml:space="preserve">1371</w:t>
             </w:r>
+            <w:r/>
           </w:p>
         </w:tc>
       </w:tr>
@@ -2644,6 +2886,7 @@
             <w:r>
               <w:t xml:space="preserve">30</w:t>
             </w:r>
+            <w:r/>
           </w:p>
         </w:tc>
         <w:tc>
@@ -2662,6 +2905,7 @@
             <w:r>
               <w:t xml:space="preserve">177.9</w:t>
             </w:r>
+            <w:r/>
           </w:p>
         </w:tc>
         <w:tc>
@@ -2680,6 +2924,7 @@
             <w:r>
               <w:t xml:space="preserve">1474</w:t>
             </w:r>
+            <w:r/>
           </w:p>
         </w:tc>
       </w:tr>
@@ -2701,6 +2946,7 @@
             <w:r>
               <w:t xml:space="preserve">40</w:t>
             </w:r>
+            <w:r/>
           </w:p>
         </w:tc>
         <w:tc>
@@ -2719,6 +2965,7 @@
             <w:r>
               <w:t xml:space="preserve">157.2</w:t>
             </w:r>
+            <w:r/>
           </w:p>
         </w:tc>
         <w:tc>
@@ -2737,6 +2984,7 @@
             <w:r>
               <w:t xml:space="preserve">1592</w:t>
             </w:r>
+            <w:r/>
           </w:p>
         </w:tc>
       </w:tr>
@@ -2758,6 +3006,7 @@
             <w:r>
               <w:t xml:space="preserve">50</w:t>
             </w:r>
+            <w:r/>
           </w:p>
         </w:tc>
         <w:tc>
@@ -2776,6 +3025,7 @@
             <w:r>
               <w:t xml:space="preserve">136.5</w:t>
             </w:r>
+            <w:r/>
           </w:p>
         </w:tc>
         <w:tc>
@@ -2794,6 +3044,7 @@
             <w:r>
               <w:t xml:space="preserve">1732</w:t>
             </w:r>
+            <w:r/>
           </w:p>
         </w:tc>
       </w:tr>
@@ -2815,6 +3066,7 @@
             <w:r>
               <w:t xml:space="preserve">60</w:t>
             </w:r>
+            <w:r/>
           </w:p>
         </w:tc>
         <w:tc>
@@ -2833,6 +3085,7 @@
             <w:r>
               <w:t xml:space="preserve">115.8</w:t>
             </w:r>
+            <w:r/>
           </w:p>
         </w:tc>
         <w:tc>
@@ -2851,6 +3104,7 @@
             <w:r>
               <w:t xml:space="preserve">1898</w:t>
             </w:r>
+            <w:r/>
           </w:p>
         </w:tc>
       </w:tr>
@@ -2872,6 +3126,7 @@
             <w:r>
               <w:t xml:space="preserve">70</w:t>
             </w:r>
+            <w:r/>
           </w:p>
         </w:tc>
         <w:tc>
@@ -2890,6 +3145,7 @@
             <w:r>
               <w:t xml:space="preserve">95.1</w:t>
             </w:r>
+            <w:r/>
           </w:p>
         </w:tc>
         <w:tc>
@@ -2908,6 +3164,7 @@
             <w:r>
               <w:t xml:space="preserve">2099</w:t>
             </w:r>
+            <w:r/>
           </w:p>
         </w:tc>
       </w:tr>
@@ -2929,6 +3186,7 @@
             <w:r>
               <w:t xml:space="preserve">80</w:t>
             </w:r>
+            <w:r/>
           </w:p>
         </w:tc>
         <w:tc>
@@ -2947,6 +3205,7 @@
             <w:r>
               <w:t xml:space="preserve">74.4</w:t>
             </w:r>
+            <w:r/>
           </w:p>
         </w:tc>
         <w:tc>
@@ -2965,6 +3224,7 @@
             <w:r>
               <w:t xml:space="preserve">2348</w:t>
             </w:r>
+            <w:r/>
           </w:p>
         </w:tc>
       </w:tr>
@@ -2986,6 +3246,7 @@
             <w:r>
               <w:t xml:space="preserve">90</w:t>
             </w:r>
+            <w:r/>
           </w:p>
         </w:tc>
         <w:tc>
@@ -3004,6 +3265,7 @@
             <w:r>
               <w:t xml:space="preserve">53.7</w:t>
             </w:r>
+            <w:r/>
           </w:p>
         </w:tc>
         <w:tc>
@@ -3022,6 +3284,7 @@
             <w:r>
               <w:t xml:space="preserve">2664</w:t>
             </w:r>
+            <w:r/>
           </w:p>
         </w:tc>
       </w:tr>
@@ -3045,6 +3308,7 @@
             <w:r>
               <w:t xml:space="preserve">100</w:t>
             </w:r>
+            <w:r/>
           </w:p>
         </w:tc>
         <w:tc>
@@ -3063,6 +3327,7 @@
             <w:r>
               <w:t xml:space="preserve">33.0</w:t>
             </w:r>
+            <w:r/>
           </w:p>
         </w:tc>
         <w:tc>
@@ -3081,6 +3346,7 @@
             <w:r>
               <w:t xml:space="preserve">3079</w:t>
             </w:r>
+            <w:r/>
           </w:p>
         </w:tc>
       </w:tr>
@@ -3098,6 +3364,14 @@
           <w:highlight w:val="none"/>
         </w:rPr>
       </w:pPr>
+      <w:r>
+        <w:rPr>
+          <w:rFonts w:ascii="Arial" w:hAnsi="Arial" w:eastAsia="Arial" w:cs="Arial"/>
+          <w:sz w:val="24"/>
+          <w:szCs w:val="24"/>
+          <w:highlight w:val="none"/>
+        </w:rPr>
+      </w:r>
       <w:r>
         <w:rPr>
           <w:rFonts w:ascii="Arial" w:hAnsi="Arial" w:eastAsia="Arial" w:cs="Arial"/>
@@ -3129,20 +3403,6 @@
         </w:rPr>
         <w:br w:type="page" w:clear="all"/>
       </w:r>
-    </w:p>
-    <w:p>
-      <w:pPr>
-        <w:pBdr/>
-        <w:spacing/>
-        <w:ind/>
-        <w:jc w:val="center"/>
-        <w:rPr>
-          <w:rFonts w:ascii="Arial" w:hAnsi="Arial" w:eastAsia="Arial" w:cs="Arial"/>
-          <w:sz w:val="24"/>
-          <w:szCs w:val="24"/>
-          <w:highlight w:val="none"/>
-        </w:rPr>
-      </w:pPr>
       <w:r>
         <w:rPr>
           <w:rFonts w:ascii="Arial" w:hAnsi="Arial" w:eastAsia="Arial" w:cs="Arial"/>
@@ -3157,8 +3417,40 @@
         <w:pBdr/>
         <w:spacing/>
         <w:ind/>
+        <w:jc w:val="center"/>
+        <w:rPr>
+          <w:rFonts w:ascii="Arial" w:hAnsi="Arial" w:eastAsia="Arial" w:cs="Arial"/>
+          <w:sz w:val="24"/>
+          <w:szCs w:val="24"/>
+          <w:highlight w:val="none"/>
+        </w:rPr>
+      </w:pPr>
+      <w:r>
+        <w:rPr>
+          <w:rFonts w:ascii="Arial" w:hAnsi="Arial" w:eastAsia="Arial" w:cs="Arial"/>
+          <w:sz w:val="24"/>
+          <w:szCs w:val="24"/>
+          <w:highlight w:val="none"/>
+        </w:rPr>
+      </w:r>
+      <w:r>
+        <w:rPr>
+          <w:rFonts w:ascii="Arial" w:hAnsi="Arial" w:eastAsia="Arial" w:cs="Arial"/>
+          <w:sz w:val="24"/>
+          <w:szCs w:val="24"/>
+          <w:highlight w:val="none"/>
+        </w:rPr>
+      </w:r>
+    </w:p>
+    <w:p>
+      <w:pPr>
+        <w:pBdr/>
+        <w:spacing/>
+        <w:ind/>
         <w:rPr/>
       </w:pPr>
+      <w:r/>
+      <w:r/>
     </w:p>
     <w:p>
       <w:pPr>
@@ -3179,6 +3471,14 @@
         </w:rPr>
         <w:t xml:space="preserve">Output Drivers and Actuators</w:t>
       </w:r>
+      <w:r>
+        <w:rPr>
+          <w:b/>
+          <w:bCs/>
+          <w:sz w:val="32"/>
+          <w:szCs w:val="32"/>
+        </w:rPr>
+      </w:r>
     </w:p>
     <w:p>
       <w:pPr>
@@ -3187,6 +3487,8 @@
         <w:ind/>
         <w:rPr/>
       </w:pPr>
+      <w:r/>
+      <w:r/>
     </w:p>
     <w:p>
       <w:pPr>
@@ -3202,8 +3504,15 @@
         <w:t xml:space="preserve">Heaters (SSR-40DA). </w:t>
       </w:r>
       <w:r>
-        <w:t xml:space="preserve">The Tank 1 and Tank 2 block heaters (200W, 120V AC) and the nozzle heater are switched by HiLetgo SSR-40DA solid state relays: control input 3-32V DC, output 24-380V AC. Each SSR control input is driven from its heater GPIO (Tank 1 Heater D4/PB5, Tank 2 Heater D5/PB4, Nozzle Heater D6/PB10) with the minus side on the common ground. These replace the SSR-40DD relays in the original design. The DD has a DC output stage and cannot switch an AC load. The 3.3V GPIO high level sits near the bottom of the DA's 3-32V input range, so confirm each relay switches reliably from the pin during bring-up.</w:t>
+        <w:t xml:space="preserve">The Tank 1 and Tank 2 block heaters (200W, 120V AC) and the nozzle heater are switche</w:t>
       </w:r>
+      <w:r>
+        <w:t xml:space="preserve">d by HiLetgo SSR-40DA solid state relays: control input 3-32V DC, output 24-380V AC. Each SSR control input is driven from its heater GPIO (Tank 1 Heater D4/PB5, Tank 2 Heater D5/PB4, Nozzle Heater D6/PB10) with the minus side on the common ground. These r</w:t>
+      </w:r>
+      <w:r>
+        <w:t xml:space="preserve">eplace the SSR-40DD relays in the original design. The DD has a DC output stage and cannot switch an AC load. The 3.3V GPIO high level sits near the bottom of the DA's 3-32V input range, so confirm each relay switches reliably from the pin during bring-up.</w:t>
+      </w:r>
+      <w:r/>
     </w:p>
     <w:p>
       <w:pPr>
@@ -3212,6 +3521,8 @@
         <w:ind/>
         <w:rPr/>
       </w:pPr>
+      <w:r/>
+      <w:r/>
     </w:p>
     <w:p>
       <w:pPr>
@@ -3227,8 +3538,18 @@
         <w:t xml:space="preserve">Tank valves (motorized ball valves). </w:t>
       </w:r>
       <w:r>
-        <w:t xml:space="preserve">Each tank has an upper and a lower valve (four total, Tank 1/2 Upper/Lower in the wiring diagram), each a U.S. Solid 1/4" motorized ball valve: 304 stainless steel, full port, normally closed, 9-24V AC/DC, 2-wire auto return. The valves run from the 12V supply. Both valves on a tank are switched together by that tank's 3.3V relay module, on the Tank 1 Valve (D2/PA10) and Tank 2 Valve (D3/PB3) outputs. Powering a valve opens it; removing power lets it return closed on its own, so a power loss or the fire-shutdown power cut leaves both tanks closed. These replace the 12V solenoid valves in the original design, which could not handle the dirty oil: they stuck and overheated almost immediately. A motorized ball valve takes time to travel between open and closed, unlike a solenoid, so firmware must wait out the measured travel time before treating the valve as open or closed.</w:t>
+        <w:t xml:space="preserve">Each tank has an upper and a lower valve (four total, Tank 1/2 Upper/Lower in the wiring diagram), each a U.S. Soli</w:t>
       </w:r>
+      <w:r>
+        <w:t xml:space="preserve">d 1/4" motorized ball valve: 304 stainless steel, full port, normally closed, 9-24V AC/DC, 2-wire auto return. The valves run from the 12V supply. Both valves on a tank are switched together by that tank's 3.3V relay module, on the Tank 1 Valve (D2/PA10) a</w:t>
+      </w:r>
+      <w:r>
+        <w:t xml:space="preserve">nd Tank 2 Valve (D3/PB3) outputs. Powering a valve opens it; removing power lets it return closed on its own, so a power loss or the fire-shutdown power cut leaves both tanks closed. These replace the 12V solenoid valves in the original design, which could</w:t>
+      </w:r>
+      <w:r>
+        <w:t xml:space="preserve"> not handle the dirty oil: they stuck and overheated almost immediately. A motorized ball valve takes time to travel between open and closed, unlike a solenoid, so firmware must wait out the measured travel time before treating the valve as open or closed.</w:t>
+      </w:r>
+      <w:r/>
     </w:p>
     <w:p>
       <w:pPr>
@@ -3237,6 +3558,8 @@
         <w:ind/>
         <w:rPr/>
       </w:pPr>
+      <w:r/>
+      <w:r/>
     </w:p>
     <w:p>
       <w:pPr>
@@ -3280,6 +3603,14 @@
           <w:highlight w:val="none"/>
         </w:rPr>
       </w:r>
+      <w:r>
+        <w:rPr>
+          <w:rFonts w:ascii="Arial" w:hAnsi="Arial" w:eastAsia="Arial" w:cs="Arial"/>
+          <w:sz w:val="24"/>
+          <w:szCs w:val="24"/>
+          <w:highlight w:val="none"/>
+        </w:rPr>
+      </w:r>
     </w:p>
     <w:p>
       <w:pPr>
@@ -3306,6 +3637,16 @@
           <w:highlight w:val="none"/>
         </w:rPr>
         <w:t xml:space="preserve">GPIO Outputs - Arduino Header</w:t>
+      </w:r>
+      <w:r>
+        <w:rPr>
+          <w:rFonts w:ascii="Arial" w:hAnsi="Arial" w:eastAsia="Arial" w:cs="Arial"/>
+          <w:b/>
+          <w:bCs/>
+          <w:sz w:val="22"/>
+          <w:szCs w:val="22"/>
+          <w:highlight w:val="none"/>
+        </w:rPr>
       </w:r>
       <w:r>
         <w:rPr>
@@ -3365,6 +3706,16 @@
               </w:rPr>
               <w:t xml:space="preserve">Signal</w:t>
             </w:r>
+            <w:r>
+              <w:rPr>
+                <w:rFonts w:ascii="Arial" w:hAnsi="Arial" w:eastAsia="Arial" w:cs="Arial"/>
+                <w:b/>
+                <w:bCs/>
+                <w:sz w:val="24"/>
+                <w:szCs w:val="24"/>
+                <w:highlight w:val="none"/>
+              </w:rPr>
+            </w:r>
           </w:p>
         </w:tc>
         <w:tc>
@@ -3398,6 +3749,16 @@
               </w:rPr>
               <w:t xml:space="preserve">Pin</w:t>
             </w:r>
+            <w:r>
+              <w:rPr>
+                <w:rFonts w:ascii="Arial" w:hAnsi="Arial" w:eastAsia="Arial" w:cs="Arial"/>
+                <w:b/>
+                <w:bCs/>
+                <w:sz w:val="24"/>
+                <w:szCs w:val="24"/>
+                <w:highlight w:val="none"/>
+              </w:rPr>
+            </w:r>
           </w:p>
         </w:tc>
         <w:tc>
@@ -3429,6 +3790,16 @@
                 <w:highlight w:val="none"/>
               </w:rPr>
               <w:t xml:space="preserve">STM32</w:t>
+            </w:r>
+            <w:r>
+              <w:rPr>
+                <w:rFonts w:ascii="Arial" w:hAnsi="Arial" w:eastAsia="Arial" w:cs="Arial"/>
+                <w:b/>
+                <w:bCs/>
+                <w:sz w:val="24"/>
+                <w:szCs w:val="24"/>
+                <w:highlight w:val="none"/>
+              </w:rPr>
             </w:r>
           </w:p>
         </w:tc>
@@ -3467,6 +3838,16 @@
               </w:rPr>
               <w:t xml:space="preserve">Tank 1 Valve</w:t>
             </w:r>
+            <w:r>
+              <w:rPr>
+                <w:rFonts w:ascii="Arial" w:hAnsi="Arial" w:eastAsia="Arial" w:cs="Arial"/>
+                <w:b/>
+                <w:bCs/>
+                <w:sz w:val="24"/>
+                <w:szCs w:val="24"/>
+                <w:highlight w:val="none"/>
+              </w:rPr>
+            </w:r>
           </w:p>
         </w:tc>
         <w:tc>
@@ -3501,6 +3882,17 @@
               </w:rPr>
               <w:t xml:space="preserve">D2</w:t>
             </w:r>
+            <w:r>
+              <w:rPr>
+                <w:rFonts w:ascii="Arial" w:hAnsi="Arial" w:eastAsia="Arial" w:cs="Arial"/>
+                <w:b/>
+                <w:bCs/>
+                <w:color w:val="fd00fd"/>
+                <w:sz w:val="24"/>
+                <w:szCs w:val="24"/>
+                <w:highlight w:val="none"/>
+              </w:rPr>
+            </w:r>
           </w:p>
         </w:tc>
         <w:tc>
@@ -3534,6 +3926,17 @@
                 <w:highlight w:val="none"/>
               </w:rPr>
               <w:t xml:space="preserve">PA10</w:t>
+            </w:r>
+            <w:r>
+              <w:rPr>
+                <w:rFonts w:ascii="Arial" w:hAnsi="Arial" w:eastAsia="Arial" w:cs="Arial"/>
+                <w:b/>
+                <w:bCs/>
+                <w:color w:val="0000ef"/>
+                <w:sz w:val="24"/>
+                <w:szCs w:val="24"/>
+                <w:highlight w:val="none"/>
+              </w:rPr>
             </w:r>
           </w:p>
         </w:tc>
@@ -3570,6 +3973,16 @@
               </w:rPr>
               <w:t xml:space="preserve">Tank 2 Valve</w:t>
             </w:r>
+            <w:r>
+              <w:rPr>
+                <w:rFonts w:ascii="Arial" w:hAnsi="Arial" w:eastAsia="Arial" w:cs="Arial"/>
+                <w:b/>
+                <w:bCs/>
+                <w:sz w:val="24"/>
+                <w:szCs w:val="24"/>
+                <w:highlight w:val="none"/>
+              </w:rPr>
+            </w:r>
           </w:p>
         </w:tc>
         <w:tc>
@@ -3604,6 +4017,17 @@
               </w:rPr>
               <w:t xml:space="preserve">D3</w:t>
             </w:r>
+            <w:r>
+              <w:rPr>
+                <w:rFonts w:ascii="Arial" w:hAnsi="Arial" w:eastAsia="Arial" w:cs="Arial"/>
+                <w:b/>
+                <w:bCs/>
+                <w:color w:val="fd00fd"/>
+                <w:sz w:val="24"/>
+                <w:szCs w:val="24"/>
+                <w:highlight w:val="none"/>
+              </w:rPr>
+            </w:r>
           </w:p>
         </w:tc>
         <w:tc>
@@ -3637,6 +4061,17 @@
                 <w:highlight w:val="none"/>
               </w:rPr>
               <w:t xml:space="preserve">PB3</w:t>
+            </w:r>
+            <w:r>
+              <w:rPr>
+                <w:rFonts w:ascii="Arial" w:hAnsi="Arial" w:eastAsia="Arial" w:cs="Arial"/>
+                <w:b/>
+                <w:bCs/>
+                <w:color w:val="0000ef"/>
+                <w:sz w:val="24"/>
+                <w:szCs w:val="24"/>
+                <w:highlight w:val="none"/>
+              </w:rPr>
             </w:r>
           </w:p>
         </w:tc>
@@ -3673,6 +4108,16 @@
               </w:rPr>
               <w:t xml:space="preserve">Tank 1 Heater</w:t>
             </w:r>
+            <w:r>
+              <w:rPr>
+                <w:rFonts w:ascii="Arial" w:hAnsi="Arial" w:eastAsia="Arial" w:cs="Arial"/>
+                <w:b/>
+                <w:bCs/>
+                <w:sz w:val="24"/>
+                <w:szCs w:val="24"/>
+                <w:highlight w:val="none"/>
+              </w:rPr>
+            </w:r>
           </w:p>
         </w:tc>
         <w:tc>
@@ -3707,6 +4152,17 @@
               </w:rPr>
               <w:t xml:space="preserve">D4</w:t>
             </w:r>
+            <w:r>
+              <w:rPr>
+                <w:rFonts w:ascii="Arial" w:hAnsi="Arial" w:eastAsia="Arial" w:cs="Arial"/>
+                <w:b/>
+                <w:bCs/>
+                <w:color w:val="fd00fd"/>
+                <w:sz w:val="24"/>
+                <w:szCs w:val="24"/>
+                <w:highlight w:val="none"/>
+              </w:rPr>
+            </w:r>
           </w:p>
         </w:tc>
         <w:tc>
@@ -3740,6 +4196,17 @@
                 <w:highlight w:val="none"/>
               </w:rPr>
               <w:t xml:space="preserve">PB5</w:t>
+            </w:r>
+            <w:r>
+              <w:rPr>
+                <w:rFonts w:ascii="Arial" w:hAnsi="Arial" w:eastAsia="Arial" w:cs="Arial"/>
+                <w:b/>
+                <w:bCs/>
+                <w:color w:val="0000ef"/>
+                <w:sz w:val="24"/>
+                <w:szCs w:val="24"/>
+                <w:highlight w:val="none"/>
+              </w:rPr>
             </w:r>
           </w:p>
         </w:tc>
@@ -3776,6 +4243,16 @@
               </w:rPr>
               <w:t xml:space="preserve">Tank 2 Heater</w:t>
             </w:r>
+            <w:r>
+              <w:rPr>
+                <w:rFonts w:ascii="Arial" w:hAnsi="Arial" w:eastAsia="Arial" w:cs="Arial"/>
+                <w:b/>
+                <w:bCs/>
+                <w:sz w:val="24"/>
+                <w:szCs w:val="24"/>
+                <w:highlight w:val="none"/>
+              </w:rPr>
+            </w:r>
           </w:p>
         </w:tc>
         <w:tc>
@@ -3810,6 +4287,17 @@
               </w:rPr>
               <w:t xml:space="preserve">D5</w:t>
             </w:r>
+            <w:r>
+              <w:rPr>
+                <w:rFonts w:ascii="Arial" w:hAnsi="Arial" w:eastAsia="Arial" w:cs="Arial"/>
+                <w:b/>
+                <w:bCs/>
+                <w:color w:val="fd00fd"/>
+                <w:sz w:val="24"/>
+                <w:szCs w:val="24"/>
+                <w:highlight w:val="none"/>
+              </w:rPr>
+            </w:r>
           </w:p>
         </w:tc>
         <w:tc>
@@ -3843,6 +4331,17 @@
                 <w:highlight w:val="none"/>
               </w:rPr>
               <w:t xml:space="preserve">PB4</w:t>
+            </w:r>
+            <w:r>
+              <w:rPr>
+                <w:rFonts w:ascii="Arial" w:hAnsi="Arial" w:eastAsia="Arial" w:cs="Arial"/>
+                <w:b/>
+                <w:bCs/>
+                <w:color w:val="0000ef"/>
+                <w:sz w:val="24"/>
+                <w:szCs w:val="24"/>
+                <w:highlight w:val="none"/>
+              </w:rPr>
             </w:r>
           </w:p>
         </w:tc>
@@ -3880,6 +4379,16 @@
               </w:rPr>
               <w:t xml:space="preserve">Nozzle Heater</w:t>
             </w:r>
+            <w:r>
+              <w:rPr>
+                <w:rFonts w:ascii="Arial" w:hAnsi="Arial" w:eastAsia="Arial" w:cs="Arial"/>
+                <w:b/>
+                <w:bCs/>
+                <w:sz w:val="24"/>
+                <w:szCs w:val="24"/>
+                <w:highlight w:val="none"/>
+              </w:rPr>
+            </w:r>
           </w:p>
         </w:tc>
         <w:tc>
@@ -3915,6 +4424,17 @@
               </w:rPr>
               <w:t xml:space="preserve">D6</w:t>
             </w:r>
+            <w:r>
+              <w:rPr>
+                <w:rFonts w:ascii="Arial" w:hAnsi="Arial" w:eastAsia="Arial" w:cs="Arial"/>
+                <w:b/>
+                <w:bCs/>
+                <w:color w:val="fd00fd"/>
+                <w:sz w:val="24"/>
+                <w:szCs w:val="24"/>
+                <w:highlight w:val="none"/>
+              </w:rPr>
+            </w:r>
           </w:p>
         </w:tc>
         <w:tc>
@@ -3949,6 +4469,17 @@
                 <w:highlight w:val="none"/>
               </w:rPr>
               <w:t xml:space="preserve">PB10</w:t>
+            </w:r>
+            <w:r>
+              <w:rPr>
+                <w:rFonts w:ascii="Arial" w:hAnsi="Arial" w:eastAsia="Arial" w:cs="Arial"/>
+                <w:b/>
+                <w:bCs/>
+                <w:color w:val="0000ef"/>
+                <w:sz w:val="24"/>
+                <w:szCs w:val="24"/>
+                <w:highlight w:val="none"/>
+              </w:rPr>
             </w:r>
           </w:p>
         </w:tc>
@@ -3986,6 +4517,16 @@
               </w:rPr>
               <w:t xml:space="preserve">Fire Ext Extend</w:t>
             </w:r>
+            <w:r>
+              <w:rPr>
+                <w:rFonts w:ascii="Arial" w:hAnsi="Arial" w:eastAsia="Arial" w:cs="Arial"/>
+                <w:b/>
+                <w:bCs/>
+                <w:sz w:val="24"/>
+                <w:szCs w:val="24"/>
+                <w:highlight w:val="none"/>
+              </w:rPr>
+            </w:r>
           </w:p>
         </w:tc>
         <w:tc>
@@ -4021,6 +4562,17 @@
               </w:rPr>
               <w:t xml:space="preserve">D7</w:t>
             </w:r>
+            <w:r>
+              <w:rPr>
+                <w:rFonts w:ascii="Arial" w:hAnsi="Arial" w:eastAsia="Arial" w:cs="Arial"/>
+                <w:b/>
+                <w:bCs/>
+                <w:color w:val="fd00fd"/>
+                <w:sz w:val="24"/>
+                <w:szCs w:val="24"/>
+                <w:highlight w:val="none"/>
+              </w:rPr>
+            </w:r>
           </w:p>
         </w:tc>
         <w:tc>
@@ -4055,6 +4607,17 @@
                 <w:highlight w:val="none"/>
               </w:rPr>
               <w:t xml:space="preserve">PA8</w:t>
+            </w:r>
+            <w:r>
+              <w:rPr>
+                <w:rFonts w:ascii="Arial" w:hAnsi="Arial" w:eastAsia="Arial" w:cs="Arial"/>
+                <w:b/>
+                <w:bCs/>
+                <w:color w:val="0000ef"/>
+                <w:sz w:val="24"/>
+                <w:szCs w:val="24"/>
+                <w:highlight w:val="none"/>
+              </w:rPr>
             </w:r>
           </w:p>
         </w:tc>
@@ -4092,6 +4655,16 @@
               </w:rPr>
               <w:t xml:space="preserve">Fire Ext Retract</w:t>
             </w:r>
+            <w:r>
+              <w:rPr>
+                <w:rFonts w:ascii="Arial" w:hAnsi="Arial" w:eastAsia="Arial" w:cs="Arial"/>
+                <w:b/>
+                <w:bCs/>
+                <w:sz w:val="24"/>
+                <w:szCs w:val="24"/>
+                <w:highlight w:val="none"/>
+              </w:rPr>
+            </w:r>
           </w:p>
         </w:tc>
         <w:tc>
@@ -4127,6 +4700,17 @@
               </w:rPr>
               <w:t xml:space="preserve">D8</w:t>
             </w:r>
+            <w:r>
+              <w:rPr>
+                <w:rFonts w:ascii="Arial" w:hAnsi="Arial" w:eastAsia="Arial" w:cs="Arial"/>
+                <w:b/>
+                <w:bCs/>
+                <w:color w:val="fd00fd"/>
+                <w:sz w:val="24"/>
+                <w:szCs w:val="24"/>
+                <w:highlight w:val="none"/>
+              </w:rPr>
+            </w:r>
           </w:p>
         </w:tc>
         <w:tc>
@@ -4161,6 +4745,17 @@
                 <w:highlight w:val="none"/>
               </w:rPr>
               <w:t xml:space="preserve">PA9</w:t>
+            </w:r>
+            <w:r>
+              <w:rPr>
+                <w:rFonts w:ascii="Arial" w:hAnsi="Arial" w:eastAsia="Arial" w:cs="Arial"/>
+                <w:b/>
+                <w:bCs/>
+                <w:color w:val="0000ef"/>
+                <w:sz w:val="24"/>
+                <w:szCs w:val="24"/>
+                <w:highlight w:val="none"/>
+              </w:rPr>
             </w:r>
           </w:p>
         </w:tc>
@@ -4198,6 +4793,16 @@
               </w:rPr>
               <w:t xml:space="preserve">Centerfuge Motor</w:t>
             </w:r>
+            <w:r>
+              <w:rPr>
+                <w:rFonts w:ascii="Arial" w:hAnsi="Arial" w:eastAsia="Arial" w:cs="Arial"/>
+                <w:b/>
+                <w:bCs/>
+                <w:sz w:val="24"/>
+                <w:szCs w:val="24"/>
+                <w:highlight w:val="none"/>
+              </w:rPr>
+            </w:r>
           </w:p>
         </w:tc>
         <w:tc>
@@ -4232,6 +4837,17 @@
                 <w:highlight w:val="none"/>
               </w:rPr>
               <w:t xml:space="preserve">D9</w:t>
+            </w:r>
+            <w:r>
+              <w:rPr>
+                <w:rFonts w:ascii="Arial" w:hAnsi="Arial" w:eastAsia="Arial" w:cs="Arial"/>
+                <w:b/>
+                <w:bCs/>
+                <w:color w:val="fd00fd"/>
+                <w:sz w:val="24"/>
+                <w:szCs w:val="24"/>
+                <w:highlight w:val="none"/>
+              </w:rPr>
             </w:r>
           </w:p>
         </w:tc>
@@ -4268,6 +4884,17 @@
               </w:rPr>
               <w:t xml:space="preserve">PC7</w:t>
             </w:r>
+            <w:r>
+              <w:rPr>
+                <w:rFonts w:ascii="Arial" w:hAnsi="Arial" w:eastAsia="Arial" w:cs="Arial"/>
+                <w:b/>
+                <w:bCs/>
+                <w:color w:val="0000ef"/>
+                <w:sz w:val="24"/>
+                <w:szCs w:val="24"/>
+                <w:highlight w:val="none"/>
+              </w:rPr>
+            </w:r>
           </w:p>
         </w:tc>
       </w:tr>
@@ -4296,6 +4923,16 @@
           <w:highlight w:val="none"/>
         </w:rPr>
         <w:t xml:space="preserve">GPIO Inputs - Morpho Header CN10</w:t>
+      </w:r>
+      <w:r>
+        <w:rPr>
+          <w:rFonts w:ascii="Arial" w:hAnsi="Arial" w:eastAsia="Arial" w:cs="Arial"/>
+          <w:b/>
+          <w:bCs/>
+          <w:sz w:val="28"/>
+          <w:szCs w:val="28"/>
+          <w:highlight w:val="none"/>
+        </w:rPr>
       </w:r>
       <w:r>
         <w:rPr>
@@ -4351,6 +4988,16 @@
               </w:rPr>
               <w:t xml:space="preserve">Signal</w:t>
             </w:r>
+            <w:r>
+              <w:rPr>
+                <w:rFonts w:ascii="Arial" w:hAnsi="Arial" w:eastAsia="Arial" w:cs="Arial"/>
+                <w:b/>
+                <w:bCs/>
+                <w:sz w:val="24"/>
+                <w:szCs w:val="24"/>
+                <w:highlight w:val="none"/>
+              </w:rPr>
+            </w:r>
           </w:p>
         </w:tc>
         <w:tc>
@@ -4382,6 +5029,16 @@
                 <w:highlight w:val="none"/>
               </w:rPr>
               <w:t xml:space="preserve">Pin</w:t>
+            </w:r>
+            <w:r>
+              <w:rPr>
+                <w:rFonts w:ascii="Arial" w:hAnsi="Arial" w:eastAsia="Arial" w:cs="Arial"/>
+                <w:b/>
+                <w:bCs/>
+                <w:sz w:val="24"/>
+                <w:szCs w:val="24"/>
+                <w:highlight w:val="none"/>
+              </w:rPr>
             </w:r>
           </w:p>
         </w:tc>
@@ -4418,6 +5075,16 @@
               </w:rPr>
               <w:t xml:space="preserve">Flame Sensor 1</w:t>
             </w:r>
+            <w:r>
+              <w:rPr>
+                <w:rFonts w:ascii="Arial" w:hAnsi="Arial" w:eastAsia="Arial" w:cs="Arial"/>
+                <w:b/>
+                <w:bCs/>
+                <w:sz w:val="24"/>
+                <w:szCs w:val="24"/>
+                <w:highlight w:val="none"/>
+              </w:rPr>
+            </w:r>
           </w:p>
         </w:tc>
         <w:tc>
@@ -4451,6 +5118,17 @@
                 <w:highlight w:val="none"/>
               </w:rPr>
               <w:t xml:space="preserve">PB1</w:t>
+            </w:r>
+            <w:r>
+              <w:rPr>
+                <w:rFonts w:ascii="Arial" w:hAnsi="Arial" w:eastAsia="Arial" w:cs="Arial"/>
+                <w:b/>
+                <w:bCs/>
+                <w:color w:val="0000ef"/>
+                <w:sz w:val="24"/>
+                <w:szCs w:val="24"/>
+                <w:highlight w:val="none"/>
+              </w:rPr>
             </w:r>
           </w:p>
         </w:tc>
@@ -4487,6 +5165,16 @@
               </w:rPr>
               <w:t xml:space="preserve">Flame Sensor 2</w:t>
             </w:r>
+            <w:r>
+              <w:rPr>
+                <w:rFonts w:ascii="Arial" w:hAnsi="Arial" w:eastAsia="Arial" w:cs="Arial"/>
+                <w:b/>
+                <w:bCs/>
+                <w:sz w:val="24"/>
+                <w:szCs w:val="24"/>
+                <w:highlight w:val="none"/>
+              </w:rPr>
+            </w:r>
           </w:p>
         </w:tc>
         <w:tc>
@@ -4520,6 +5208,17 @@
                 <w:highlight w:val="none"/>
               </w:rPr>
               <w:t xml:space="preserve">PB2</w:t>
+            </w:r>
+            <w:r>
+              <w:rPr>
+                <w:rFonts w:ascii="Arial" w:hAnsi="Arial" w:eastAsia="Arial" w:cs="Arial"/>
+                <w:b/>
+                <w:bCs/>
+                <w:color w:val="0000ef"/>
+                <w:sz w:val="24"/>
+                <w:szCs w:val="24"/>
+                <w:highlight w:val="none"/>
+              </w:rPr>
             </w:r>
           </w:p>
         </w:tc>
@@ -4556,6 +5255,16 @@
               </w:rPr>
               <w:t xml:space="preserve">Flame Sensor 3</w:t>
             </w:r>
+            <w:r>
+              <w:rPr>
+                <w:rFonts w:ascii="Arial" w:hAnsi="Arial" w:eastAsia="Arial" w:cs="Arial"/>
+                <w:b/>
+                <w:bCs/>
+                <w:sz w:val="24"/>
+                <w:szCs w:val="24"/>
+                <w:highlight w:val="none"/>
+              </w:rPr>
+            </w:r>
           </w:p>
         </w:tc>
         <w:tc>
@@ -4590,6 +5299,17 @@
               </w:rPr>
               <w:t xml:space="preserve">PC5</w:t>
             </w:r>
+            <w:r>
+              <w:rPr>
+                <w:rFonts w:ascii="Arial" w:hAnsi="Arial" w:eastAsia="Arial" w:cs="Arial"/>
+                <w:b/>
+                <w:bCs/>
+                <w:color w:val="0000ef"/>
+                <w:sz w:val="24"/>
+                <w:szCs w:val="24"/>
+                <w:highlight w:val="none"/>
+              </w:rPr>
+            </w:r>
           </w:p>
         </w:tc>
       </w:tr>
@@ -4618,6 +5338,16 @@
           <w:highlight w:val="none"/>
         </w:rPr>
         <w:t xml:space="preserve">ADC Inputs - Arduino Header </w:t>
+      </w:r>
+      <w:r>
+        <w:rPr>
+          <w:rFonts w:ascii="Arial" w:hAnsi="Arial" w:eastAsia="Arial" w:cs="Arial"/>
+          <w:b/>
+          <w:bCs/>
+          <w:sz w:val="24"/>
+          <w:szCs w:val="24"/>
+          <w:highlight w:val="none"/>
+        </w:rPr>
       </w:r>
     </w:p>
     <w:tbl>
@@ -4660,6 +5390,14 @@
               </w:rPr>
               <w:t xml:space="preserve">Signal</w:t>
             </w:r>
+            <w:r>
+              <w:rPr>
+                <w:rFonts w:ascii="Arial" w:hAnsi="Arial" w:eastAsia="Arial" w:cs="Arial"/>
+                <w:sz w:val="24"/>
+                <w:szCs w:val="24"/>
+                <w:highlight w:val="none"/>
+              </w:rPr>
+            </w:r>
           </w:p>
         </w:tc>
         <w:tc>
@@ -4688,6 +5426,14 @@
               </w:rPr>
               <w:t xml:space="preserve">Pin</w:t>
             </w:r>
+            <w:r>
+              <w:rPr>
+                <w:rFonts w:ascii="Arial" w:hAnsi="Arial" w:eastAsia="Arial" w:cs="Arial"/>
+                <w:sz w:val="24"/>
+                <w:szCs w:val="24"/>
+                <w:highlight w:val="none"/>
+              </w:rPr>
+            </w:r>
           </w:p>
         </w:tc>
         <w:tc>
@@ -4715,6 +5461,14 @@
                 <w:highlight w:val="none"/>
               </w:rPr>
               <w:t xml:space="preserve">STM32</w:t>
+            </w:r>
+            <w:r>
+              <w:rPr>
+                <w:rFonts w:ascii="Arial" w:hAnsi="Arial" w:eastAsia="Arial" w:cs="Arial"/>
+                <w:sz w:val="24"/>
+                <w:szCs w:val="24"/>
+                <w:highlight w:val="none"/>
+              </w:rPr>
             </w:r>
           </w:p>
         </w:tc>
@@ -4746,6 +5500,14 @@
                 <w:highlight w:val="none"/>
               </w:rPr>
               <w:t xml:space="preserve">Tank 1 Temp</w:t>
+            </w:r>
+            <w:r>
+              <w:rPr>
+                <w:rFonts w:ascii="Arial" w:hAnsi="Arial" w:eastAsia="Arial" w:cs="Arial"/>
+                <w:sz w:val="24"/>
+                <w:szCs w:val="24"/>
+                <w:highlight w:val="none"/>
+              </w:rPr>
             </w:r>
           </w:p>
         </w:tc>
@@ -4781,6 +5543,17 @@
               </w:rPr>
               <w:t xml:space="preserve">A0</w:t>
             </w:r>
+            <w:r>
+              <w:rPr>
+                <w:rFonts w:ascii="Arial" w:hAnsi="Arial" w:eastAsia="Arial" w:cs="Arial"/>
+                <w:b/>
+                <w:bCs/>
+                <w:color w:val="fd00fd"/>
+                <w:sz w:val="24"/>
+                <w:szCs w:val="24"/>
+                <w:highlight w:val="none"/>
+              </w:rPr>
+            </w:r>
           </w:p>
         </w:tc>
         <w:tc>
@@ -4815,6 +5588,17 @@
               </w:rPr>
               <w:t xml:space="preserve">PA0</w:t>
             </w:r>
+            <w:r>
+              <w:rPr>
+                <w:rFonts w:ascii="Arial" w:hAnsi="Arial" w:eastAsia="Arial" w:cs="Arial"/>
+                <w:b/>
+                <w:bCs/>
+                <w:color w:val="0000ef"/>
+                <w:sz w:val="24"/>
+                <w:szCs w:val="24"/>
+                <w:highlight w:val="none"/>
+              </w:rPr>
+            </w:r>
           </w:p>
         </w:tc>
       </w:tr>
@@ -4845,6 +5629,14 @@
                 <w:highlight w:val="none"/>
               </w:rPr>
               <w:t xml:space="preserve">Tank 2 Temp</w:t>
+            </w:r>
+            <w:r>
+              <w:rPr>
+                <w:rFonts w:ascii="Arial" w:hAnsi="Arial" w:eastAsia="Arial" w:cs="Arial"/>
+                <w:sz w:val="24"/>
+                <w:szCs w:val="24"/>
+                <w:highlight w:val="none"/>
+              </w:rPr>
             </w:r>
           </w:p>
         </w:tc>
@@ -4880,6 +5672,17 @@
               </w:rPr>
               <w:t xml:space="preserve">A1</w:t>
             </w:r>
+            <w:r>
+              <w:rPr>
+                <w:rFonts w:ascii="Arial" w:hAnsi="Arial" w:eastAsia="Arial" w:cs="Arial"/>
+                <w:b/>
+                <w:bCs/>
+                <w:color w:val="fd00fd"/>
+                <w:sz w:val="24"/>
+                <w:szCs w:val="24"/>
+                <w:highlight w:val="none"/>
+              </w:rPr>
+            </w:r>
           </w:p>
         </w:tc>
         <w:tc>
@@ -4914,6 +5717,17 @@
               </w:rPr>
               <w:t xml:space="preserve">PA1</w:t>
             </w:r>
+            <w:r>
+              <w:rPr>
+                <w:rFonts w:ascii="Arial" w:hAnsi="Arial" w:eastAsia="Arial" w:cs="Arial"/>
+                <w:b/>
+                <w:bCs/>
+                <w:color w:val="0000ef"/>
+                <w:sz w:val="24"/>
+                <w:szCs w:val="24"/>
+                <w:highlight w:val="none"/>
+              </w:rPr>
+            </w:r>
           </w:p>
         </w:tc>
       </w:tr>
@@ -4944,6 +5758,14 @@
                 <w:highlight w:val="none"/>
               </w:rPr>
               <w:t xml:space="preserve">Nozzle Temp</w:t>
+            </w:r>
+            <w:r>
+              <w:rPr>
+                <w:rFonts w:ascii="Arial" w:hAnsi="Arial" w:eastAsia="Arial" w:cs="Arial"/>
+                <w:sz w:val="24"/>
+                <w:szCs w:val="24"/>
+                <w:highlight w:val="none"/>
+              </w:rPr>
             </w:r>
           </w:p>
         </w:tc>
@@ -4979,6 +5801,17 @@
               </w:rPr>
               <w:t xml:space="preserve">A2</w:t>
             </w:r>
+            <w:r>
+              <w:rPr>
+                <w:rFonts w:ascii="Arial" w:hAnsi="Arial" w:eastAsia="Arial" w:cs="Arial"/>
+                <w:b/>
+                <w:bCs/>
+                <w:color w:val="fd00fd"/>
+                <w:sz w:val="24"/>
+                <w:szCs w:val="24"/>
+                <w:highlight w:val="none"/>
+              </w:rPr>
+            </w:r>
           </w:p>
         </w:tc>
         <w:tc>
@@ -5013,6 +5846,17 @@
               </w:rPr>
               <w:t xml:space="preserve">PA4</w:t>
             </w:r>
+            <w:r>
+              <w:rPr>
+                <w:rFonts w:ascii="Arial" w:hAnsi="Arial" w:eastAsia="Arial" w:cs="Arial"/>
+                <w:b/>
+                <w:bCs/>
+                <w:color w:val="0000ef"/>
+                <w:sz w:val="24"/>
+                <w:szCs w:val="24"/>
+                <w:highlight w:val="none"/>
+              </w:rPr>
+            </w:r>
           </w:p>
         </w:tc>
       </w:tr>
@@ -5044,6 +5888,14 @@
                 <w:highlight w:val="none"/>
               </w:rPr>
               <w:t xml:space="preserve">Tank 1 Level </w:t>
+            </w:r>
+            <w:r>
+              <w:rPr>
+                <w:rFonts w:ascii="Arial" w:hAnsi="Arial" w:eastAsia="Arial" w:cs="Arial"/>
+                <w:sz w:val="24"/>
+                <w:szCs w:val="24"/>
+                <w:highlight w:val="none"/>
+              </w:rPr>
             </w:r>
           </w:p>
         </w:tc>
@@ -5080,6 +5932,17 @@
               </w:rPr>
               <w:t xml:space="preserve">A3</w:t>
             </w:r>
+            <w:r>
+              <w:rPr>
+                <w:rFonts w:ascii="Arial" w:hAnsi="Arial" w:eastAsia="Arial" w:cs="Arial"/>
+                <w:b/>
+                <w:bCs/>
+                <w:color w:val="fd00fd"/>
+                <w:sz w:val="24"/>
+                <w:szCs w:val="24"/>
+                <w:highlight w:val="none"/>
+              </w:rPr>
+            </w:r>
           </w:p>
         </w:tc>
         <w:tc>
@@ -5115,6 +5978,17 @@
               </w:rPr>
               <w:t xml:space="preserve">PB0</w:t>
             </w:r>
+            <w:r>
+              <w:rPr>
+                <w:rFonts w:ascii="Arial" w:hAnsi="Arial" w:eastAsia="Arial" w:cs="Arial"/>
+                <w:b/>
+                <w:bCs/>
+                <w:color w:val="0000ef"/>
+                <w:sz w:val="24"/>
+                <w:szCs w:val="24"/>
+                <w:highlight w:val="none"/>
+              </w:rPr>
+            </w:r>
           </w:p>
         </w:tc>
       </w:tr>
@@ -5146,6 +6020,14 @@
                 <w:highlight w:val="none"/>
               </w:rPr>
               <w:t xml:space="preserve">Tank 2 Level</w:t>
+            </w:r>
+            <w:r>
+              <w:rPr>
+                <w:rFonts w:ascii="Arial" w:hAnsi="Arial" w:eastAsia="Arial" w:cs="Arial"/>
+                <w:sz w:val="24"/>
+                <w:szCs w:val="24"/>
+                <w:highlight w:val="none"/>
+              </w:rPr>
             </w:r>
           </w:p>
         </w:tc>
@@ -5182,6 +6064,17 @@
               </w:rPr>
               <w:t xml:space="preserve">A4</w:t>
             </w:r>
+            <w:r>
+              <w:rPr>
+                <w:rFonts w:ascii="Arial" w:hAnsi="Arial" w:eastAsia="Arial" w:cs="Arial"/>
+                <w:b/>
+                <w:bCs/>
+                <w:color w:val="fd00fd"/>
+                <w:sz w:val="24"/>
+                <w:szCs w:val="24"/>
+                <w:highlight w:val="none"/>
+              </w:rPr>
+            </w:r>
           </w:p>
         </w:tc>
         <w:tc>
@@ -5217,6 +6110,17 @@
               </w:rPr>
               <w:t xml:space="preserve">PC1</w:t>
             </w:r>
+            <w:r>
+              <w:rPr>
+                <w:rFonts w:ascii="Arial" w:hAnsi="Arial" w:eastAsia="Arial" w:cs="Arial"/>
+                <w:b/>
+                <w:bCs/>
+                <w:color w:val="0000ef"/>
+                <w:sz w:val="24"/>
+                <w:szCs w:val="24"/>
+                <w:highlight w:val="none"/>
+              </w:rPr>
+            </w:r>
           </w:p>
         </w:tc>
       </w:tr>
@@ -5242,7 +6146,15 @@
           <w:szCs w:val="24"/>
           <w:highlight w:val="none"/>
         </w:rPr>
-        <w:t>Serial - USART1</w:t>
+        <w:t xml:space="preserve">Serial - USART1</w:t>
+      </w:r>
+      <w:r>
+        <w:rPr>
+          <w:rFonts w:ascii="Arial" w:hAnsi="Arial" w:eastAsia="Arial" w:cs="Arial"/>
+          <w:sz w:val="22"/>
+          <w:szCs w:val="22"/>
+          <w:highlight w:val="none"/>
+        </w:rPr>
       </w:r>
       <w:r>
         <w:rPr>
@@ -5293,6 +6205,14 @@
               </w:rPr>
               <w:t xml:space="preserve">Signal</w:t>
             </w:r>
+            <w:r>
+              <w:rPr>
+                <w:rFonts w:ascii="Arial" w:hAnsi="Arial" w:eastAsia="Arial" w:cs="Arial"/>
+                <w:sz w:val="24"/>
+                <w:szCs w:val="24"/>
+                <w:highlight w:val="none"/>
+              </w:rPr>
+            </w:r>
           </w:p>
         </w:tc>
         <w:tc>
@@ -5321,6 +6241,14 @@
               </w:rPr>
               <w:t xml:space="preserve">Pin</w:t>
             </w:r>
+            <w:r>
+              <w:rPr>
+                <w:rFonts w:ascii="Arial" w:hAnsi="Arial" w:eastAsia="Arial" w:cs="Arial"/>
+                <w:sz w:val="24"/>
+                <w:szCs w:val="24"/>
+                <w:highlight w:val="none"/>
+              </w:rPr>
+            </w:r>
           </w:p>
         </w:tc>
         <w:tc>
@@ -5348,6 +6276,14 @@
                 <w:highlight w:val="none"/>
               </w:rPr>
               <w:t xml:space="preserve">STM32</w:t>
+            </w:r>
+            <w:r>
+              <w:rPr>
+                <w:rFonts w:ascii="Arial" w:hAnsi="Arial" w:eastAsia="Arial" w:cs="Arial"/>
+                <w:sz w:val="24"/>
+                <w:szCs w:val="24"/>
+                <w:highlight w:val="none"/>
+              </w:rPr>
             </w:r>
           </w:p>
         </w:tc>
@@ -5379,6 +6315,14 @@
                 <w:highlight w:val="none"/>
               </w:rPr>
               <w:t xml:space="preserve">TX</w:t>
+            </w:r>
+            <w:r>
+              <w:rPr>
+                <w:rFonts w:ascii="Arial" w:hAnsi="Arial" w:eastAsia="Arial" w:cs="Arial"/>
+                <w:sz w:val="24"/>
+                <w:szCs w:val="24"/>
+                <w:highlight w:val="none"/>
+              </w:rPr>
             </w:r>
           </w:p>
         </w:tc>
@@ -5434,6 +6378,16 @@
                 <w:highlight w:val="none"/>
               </w:rPr>
             </w:r>
+            <w:r>
+              <w:rPr>
+                <w:rFonts w:ascii="Arial" w:hAnsi="Arial" w:eastAsia="Arial" w:cs="Arial"/>
+                <w:b/>
+                <w:bCs/>
+                <w:sz w:val="24"/>
+                <w:szCs w:val="24"/>
+                <w:highlight w:val="none"/>
+              </w:rPr>
+            </w:r>
           </w:p>
         </w:tc>
         <w:tc>
@@ -5468,6 +6422,17 @@
               </w:rPr>
               <w:t xml:space="preserve">PB6</w:t>
             </w:r>
+            <w:r>
+              <w:rPr>
+                <w:rFonts w:ascii="Arial" w:hAnsi="Arial" w:eastAsia="Arial" w:cs="Arial"/>
+                <w:b/>
+                <w:bCs/>
+                <w:color w:val="0000ef"/>
+                <w:sz w:val="24"/>
+                <w:szCs w:val="24"/>
+                <w:highlight w:val="none"/>
+              </w:rPr>
+            </w:r>
           </w:p>
         </w:tc>
       </w:tr>
@@ -5498,6 +6463,14 @@
                 <w:highlight w:val="none"/>
               </w:rPr>
               <w:t xml:space="preserve">RX</w:t>
+            </w:r>
+            <w:r>
+              <w:rPr>
+                <w:rFonts w:ascii="Arial" w:hAnsi="Arial" w:eastAsia="Arial" w:cs="Arial"/>
+                <w:sz w:val="24"/>
+                <w:szCs w:val="24"/>
+                <w:highlight w:val="none"/>
+              </w:rPr>
             </w:r>
           </w:p>
         </w:tc>
@@ -5533,6 +6506,17 @@
               </w:rPr>
               <w:t xml:space="preserve">(MorphoCN7) </w:t>
             </w:r>
+            <w:r>
+              <w:rPr>
+                <w:rFonts w:ascii="Arial" w:hAnsi="Arial" w:eastAsia="Arial" w:cs="Arial"/>
+                <w:b/>
+                <w:bCs/>
+                <w:color w:val="0000ef"/>
+                <w:sz w:val="24"/>
+                <w:szCs w:val="24"/>
+                <w:highlight w:val="none"/>
+              </w:rPr>
+            </w:r>
           </w:p>
         </w:tc>
         <w:tc>
@@ -5567,6 +6551,17 @@
               </w:rPr>
               <w:t xml:space="preserve">PB7</w:t>
             </w:r>
+            <w:r>
+              <w:rPr>
+                <w:rFonts w:ascii="Arial" w:hAnsi="Arial" w:eastAsia="Arial" w:cs="Arial"/>
+                <w:b/>
+                <w:bCs/>
+                <w:color w:val="0000ef"/>
+                <w:sz w:val="24"/>
+                <w:szCs w:val="24"/>
+                <w:highlight w:val="none"/>
+              </w:rPr>
+            </w:r>
           </w:p>
         </w:tc>
       </w:tr>
@@ -5604,7 +6599,15 @@
           <w:szCs w:val="24"/>
           <w:highlight w:val="none"/>
         </w:rPr>
-        <w:t>Serial USART1</w:t>
+        <w:t xml:space="preserve">Serial USART1</w:t>
+      </w:r>
+      <w:r>
+        <w:rPr>
+          <w:rFonts w:ascii="Arial" w:hAnsi="Arial" w:eastAsia="Arial" w:cs="Arial"/>
+          <w:sz w:val="24"/>
+          <w:szCs w:val="24"/>
+          <w:highlight w:val="none"/>
+        </w:rPr>
       </w:r>
       <w:r>
         <w:rPr>
@@ -5659,6 +6662,16 @@
               </w:rPr>
               <w:t xml:space="preserve">Signal</w:t>
             </w:r>
+            <w:r>
+              <w:rPr>
+                <w:rFonts w:ascii="Arial" w:hAnsi="Arial" w:eastAsia="Arial" w:cs="Arial"/>
+                <w:b/>
+                <w:bCs/>
+                <w:sz w:val="28"/>
+                <w:szCs w:val="28"/>
+                <w:highlight w:val="none"/>
+              </w:rPr>
+            </w:r>
           </w:p>
         </w:tc>
         <w:tc>
@@ -5691,6 +6704,16 @@
               </w:rPr>
               <w:t xml:space="preserve">Pin</w:t>
             </w:r>
+            <w:r>
+              <w:rPr>
+                <w:rFonts w:ascii="Arial" w:hAnsi="Arial" w:eastAsia="Arial" w:cs="Arial"/>
+                <w:b/>
+                <w:bCs/>
+                <w:sz w:val="28"/>
+                <w:szCs w:val="28"/>
+                <w:highlight w:val="none"/>
+              </w:rPr>
+            </w:r>
           </w:p>
         </w:tc>
         <w:tc>
@@ -5722,6 +6745,16 @@
                 <w:highlight w:val="none"/>
               </w:rPr>
               <w:t xml:space="preserve">STM32 Connection</w:t>
+            </w:r>
+            <w:r>
+              <w:rPr>
+                <w:rFonts w:ascii="Arial" w:hAnsi="Arial" w:eastAsia="Arial" w:cs="Arial"/>
+                <w:b/>
+                <w:bCs/>
+                <w:sz w:val="28"/>
+                <w:szCs w:val="28"/>
+                <w:highlight w:val="none"/>
+              </w:rPr>
             </w:r>
           </w:p>
         </w:tc>
@@ -5758,6 +6791,16 @@
               </w:rPr>
               <w:t xml:space="preserve">TX</w:t>
             </w:r>
+            <w:r>
+              <w:rPr>
+                <w:rFonts w:ascii="Arial" w:hAnsi="Arial" w:eastAsia="Arial" w:cs="Arial"/>
+                <w:b/>
+                <w:bCs/>
+                <w:sz w:val="28"/>
+                <w:szCs w:val="28"/>
+                <w:highlight w:val="none"/>
+              </w:rPr>
+            </w:r>
           </w:p>
         </w:tc>
         <w:tc>
@@ -5790,6 +6833,16 @@
               </w:rPr>
               <w:t xml:space="preserve">TXD Pin 8</w:t>
             </w:r>
+            <w:r>
+              <w:rPr>
+                <w:rFonts w:ascii="Arial" w:hAnsi="Arial" w:eastAsia="Arial" w:cs="Arial"/>
+                <w:b/>
+                <w:bCs/>
+                <w:sz w:val="28"/>
+                <w:szCs w:val="28"/>
+                <w:highlight w:val="none"/>
+              </w:rPr>
+            </w:r>
           </w:p>
         </w:tc>
         <w:tc>
@@ -5821,6 +6874,16 @@
                 <w:highlight w:val="none"/>
               </w:rPr>
               <w:t xml:space="preserve">PB7</w:t>
+            </w:r>
+            <w:r>
+              <w:rPr>
+                <w:rFonts w:ascii="Arial" w:hAnsi="Arial" w:eastAsia="Arial" w:cs="Arial"/>
+                <w:b/>
+                <w:bCs/>
+                <w:sz w:val="28"/>
+                <w:szCs w:val="28"/>
+                <w:highlight w:val="none"/>
+              </w:rPr>
             </w:r>
           </w:p>
         </w:tc>
@@ -5857,6 +6920,16 @@
               </w:rPr>
               <w:t xml:space="preserve">RX</w:t>
             </w:r>
+            <w:r>
+              <w:rPr>
+                <w:rFonts w:ascii="Arial" w:hAnsi="Arial" w:eastAsia="Arial" w:cs="Arial"/>
+                <w:b/>
+                <w:bCs/>
+                <w:sz w:val="28"/>
+                <w:szCs w:val="28"/>
+                <w:highlight w:val="none"/>
+              </w:rPr>
+            </w:r>
           </w:p>
         </w:tc>
         <w:tc>
@@ -5889,6 +6962,16 @@
               </w:rPr>
               <w:t xml:space="preserve">RXD Pin 10</w:t>
             </w:r>
+            <w:r>
+              <w:rPr>
+                <w:rFonts w:ascii="Arial" w:hAnsi="Arial" w:eastAsia="Arial" w:cs="Arial"/>
+                <w:b/>
+                <w:bCs/>
+                <w:sz w:val="28"/>
+                <w:szCs w:val="28"/>
+                <w:highlight w:val="none"/>
+              </w:rPr>
+            </w:r>
           </w:p>
         </w:tc>
         <w:tc>
@@ -5920,6 +7003,16 @@
                 <w:highlight w:val="none"/>
               </w:rPr>
               <w:t xml:space="preserve">PB6</w:t>
+            </w:r>
+            <w:r>
+              <w:rPr>
+                <w:rFonts w:ascii="Arial" w:hAnsi="Arial" w:eastAsia="Arial" w:cs="Arial"/>
+                <w:b/>
+                <w:bCs/>
+                <w:sz w:val="28"/>
+                <w:szCs w:val="28"/>
+                <w:highlight w:val="none"/>
+              </w:rPr>
             </w:r>
           </w:p>
         </w:tc>
@@ -5957,6 +7050,16 @@
               </w:rPr>
               <w:t xml:space="preserve">Ground</w:t>
             </w:r>
+            <w:r>
+              <w:rPr>
+                <w:rFonts w:ascii="Arial" w:hAnsi="Arial" w:eastAsia="Arial" w:cs="Arial"/>
+                <w:b/>
+                <w:bCs/>
+                <w:sz w:val="28"/>
+                <w:szCs w:val="28"/>
+                <w:highlight w:val="none"/>
+              </w:rPr>
+            </w:r>
           </w:p>
         </w:tc>
         <w:tc>
@@ -5989,6 +7092,16 @@
                 <w:highlight w:val="none"/>
               </w:rPr>
               <w:t xml:space="preserve">GND Pin 6</w:t>
+            </w:r>
+            <w:r>
+              <w:rPr>
+                <w:rFonts w:ascii="Arial" w:hAnsi="Arial" w:eastAsia="Arial" w:cs="Arial"/>
+                <w:b/>
+                <w:bCs/>
+                <w:sz w:val="28"/>
+                <w:szCs w:val="28"/>
+                <w:highlight w:val="none"/>
+              </w:rPr>
             </w:r>
           </w:p>
         </w:tc>
@@ -6023,6 +7136,16 @@
               </w:rPr>
               <w:t xml:space="preserve">STM32 GND</w:t>
             </w:r>
+            <w:r>
+              <w:rPr>
+                <w:rFonts w:ascii="Arial" w:hAnsi="Arial" w:eastAsia="Arial" w:cs="Arial"/>
+                <w:b/>
+                <w:bCs/>
+                <w:sz w:val="28"/>
+                <w:szCs w:val="28"/>
+                <w:highlight w:val="none"/>
+              </w:rPr>
+            </w:r>
           </w:p>
         </w:tc>
       </w:tr>
@@ -6057,6 +7180,14 @@
           <w:highlight w:val="none"/>
         </w:rPr>
       </w:r>
+      <w:r>
+        <w:rPr>
+          <w:rFonts w:ascii="Arial" w:hAnsi="Arial" w:eastAsia="Arial" w:cs="Arial"/>
+          <w:sz w:val="24"/>
+          <w:szCs w:val="24"/>
+          <w:highlight w:val="none"/>
+        </w:rPr>
+      </w:r>
     </w:p>
     <w:p>
       <w:pPr>
@@ -6072,6 +7203,16 @@
           <w:highlight w:val="none"/>
         </w:rPr>
       </w:pPr>
+      <w:r>
+        <w:rPr>
+          <w:b/>
+          <w:bCs/>
+          <w:color w:val="000000" w:themeColor="text1"/>
+          <w:sz w:val="32"/>
+          <w:szCs w:val="32"/>
+          <w:highlight w:val="none"/>
+        </w:rPr>
+      </w:r>
       <w:r>
         <w:rPr>
           <w:b/>
@@ -6097,6 +7238,16 @@
           <w:highlight w:val="none"/>
         </w:rPr>
       </w:pPr>
+      <w:r>
+        <w:rPr>
+          <w:b/>
+          <w:bCs/>
+          <w:color w:val="000000" w:themeColor="text1"/>
+          <w:sz w:val="32"/>
+          <w:szCs w:val="32"/>
+          <w:highlight w:val="none"/>
+        </w:rPr>
+      </w:r>
       <w:r>
         <w:rPr>
           <w:b/>
@@ -6137,6 +7288,16 @@
           <w:highlight w:val="none"/>
         </w:rPr>
         <w:t xml:space="preserve">Pinout Diagrams</w:t>
+      </w:r>
+      <w:r>
+        <w:rPr>
+          <w:b/>
+          <w:bCs/>
+          <w:color w:val="000000" w:themeColor="text1"/>
+          <w:sz w:val="32"/>
+          <w:szCs w:val="32"/>
+          <w:highlight w:val="none"/>
+        </w:rPr>
       </w:r>
     </w:p>
     <w:p>
@@ -6272,6 +7433,17 @@
           <w:highlight w:val="none"/>
         </w:rPr>
       </w:r>
+      <w:r>
+        <w:rPr>
+          <w:rFonts w:ascii="Arial" w:hAnsi="Arial" w:eastAsia="Arial" w:cs="Arial"/>
+          <w:b/>
+          <w:bCs/>
+          <w:color w:val="000000" w:themeColor="text1"/>
+          <w:sz w:val="24"/>
+          <w:szCs w:val="24"/>
+          <w:highlight w:val="none"/>
+        </w:rPr>
+      </w:r>
     </w:p>
     <w:p>
       <w:pPr>
@@ -6288,6 +7460,14 @@
       <w:r>
         <w:rPr>
           <w:rFonts w:ascii="Arial" w:hAnsi="Arial" w:eastAsia="Arial" w:cs="Arial"/>
+          <w:sz w:val="24"/>
+          <w:szCs w:val="24"/>
+          <w:highlight w:val="none"/>
+        </w:rPr>
+      </w:r>
+      <w:r>
+        <w:rPr>
+          <w:rFonts w:ascii="Arial" w:hAnsi="Arial" w:cs="Arial"/>
           <w:sz w:val="24"/>
           <w:szCs w:val="24"/>
           <w:highlight w:val="none"/>
@@ -6398,16 +7578,6 @@
           <w:highlight w:val="none"/>
         </w:rPr>
       </w:r>
-    </w:p>
-    <w:p>
-      <w:pPr>
-        <w:pBdr/>
-        <w:spacing/>
-        <w:ind/>
-        <w:rPr>
-          <w:highlight w:val="none"/>
-        </w:rPr>
-      </w:pPr>
       <w:r>
         <w:rPr>
           <w:highlight w:val="none"/>
@@ -6428,16 +7598,6 @@
           <w:highlight w:val="none"/>
         </w:rPr>
       </w:r>
-    </w:p>
-    <w:p>
-      <w:pPr>
-        <w:pBdr/>
-        <w:spacing/>
-        <w:ind/>
-        <w:rPr>
-          <w:highlight w:val="none"/>
-        </w:rPr>
-      </w:pPr>
       <w:r>
         <w:rPr>
           <w:highlight w:val="none"/>
@@ -6458,16 +7618,6 @@
           <w:highlight w:val="none"/>
         </w:rPr>
       </w:r>
-    </w:p>
-    <w:p>
-      <w:pPr>
-        <w:pBdr/>
-        <w:spacing/>
-        <w:ind/>
-        <w:rPr>
-          <w:highlight w:val="none"/>
-        </w:rPr>
-      </w:pPr>
       <w:r>
         <w:rPr>
           <w:highlight w:val="none"/>
@@ -6488,16 +7638,6 @@
           <w:highlight w:val="none"/>
         </w:rPr>
       </w:r>
-    </w:p>
-    <w:p>
-      <w:pPr>
-        <w:pBdr/>
-        <w:spacing/>
-        <w:ind/>
-        <w:rPr>
-          <w:highlight w:val="none"/>
-        </w:rPr>
-      </w:pPr>
       <w:r>
         <w:rPr>
           <w:highlight w:val="none"/>
@@ -6513,6 +7653,91 @@
           <w:highlight w:val="none"/>
         </w:rPr>
       </w:pPr>
+      <w:r>
+        <w:rPr>
+          <w:highlight w:val="none"/>
+        </w:rPr>
+      </w:r>
+      <w:r>
+        <w:rPr>
+          <w:highlight w:val="none"/>
+        </w:rPr>
+      </w:r>
+    </w:p>
+    <w:p>
+      <w:pPr>
+        <w:pBdr/>
+        <w:spacing/>
+        <w:ind/>
+        <w:rPr>
+          <w:highlight w:val="none"/>
+        </w:rPr>
+      </w:pPr>
+      <w:r>
+        <w:rPr>
+          <w:highlight w:val="none"/>
+        </w:rPr>
+      </w:r>
+      <w:r>
+        <w:rPr>
+          <w:highlight w:val="none"/>
+        </w:rPr>
+      </w:r>
+    </w:p>
+    <w:p>
+      <w:pPr>
+        <w:pBdr/>
+        <w:spacing/>
+        <w:ind/>
+        <w:rPr>
+          <w:highlight w:val="none"/>
+        </w:rPr>
+      </w:pPr>
+      <w:r>
+        <w:rPr>
+          <w:highlight w:val="none"/>
+        </w:rPr>
+      </w:r>
+      <w:r>
+        <w:rPr>
+          <w:highlight w:val="none"/>
+        </w:rPr>
+      </w:r>
+    </w:p>
+    <w:p>
+      <w:pPr>
+        <w:pBdr/>
+        <w:spacing/>
+        <w:ind/>
+        <w:rPr>
+          <w:highlight w:val="none"/>
+        </w:rPr>
+      </w:pPr>
+      <w:r>
+        <w:rPr>
+          <w:highlight w:val="none"/>
+        </w:rPr>
+      </w:r>
+      <w:r>
+        <w:rPr>
+          <w:highlight w:val="none"/>
+        </w:rPr>
+      </w:r>
+    </w:p>
+    <w:p>
+      <w:pPr>
+        <w:pBdr/>
+        <w:spacing/>
+        <w:ind/>
+        <w:rPr>
+          <w:highlight w:val="none"/>
+        </w:rPr>
+      </w:pPr>
+      <w:r>
+        <w:rPr>
+          <w:highlight w:val="none"/>
+        </w:rPr>
+      </w:r>
       <w:r>
         <w:rPr>
           <w:highlight w:val="none"/>
@@ -6616,6 +7841,11 @@
         </w:rPr>
         <w:br w:type="page" w:clear="all"/>
       </w:r>
+      <w:r>
+        <w:rPr>
+          <w:highlight w:val="none"/>
+        </w:rPr>
+      </w:r>
     </w:p>
     <w:p>
       <w:pPr>
@@ -6639,6 +7869,15 @@
           <w:highlight w:val="none"/>
         </w:rPr>
         <w:t xml:space="preserve">Raspberry Pi 2 Model B</w:t>
+      </w:r>
+      <w:r>
+        <w:rPr>
+          <w:b/>
+          <w:bCs/>
+          <w:sz w:val="28"/>
+          <w:szCs w:val="28"/>
+          <w:highlight w:val="none"/>
+        </w:rPr>
       </w:r>
     </w:p>
     <w:p>
@@ -6738,6 +7977,11 @@
         </w:rPr>
         <w:br w:type="page" w:clear="all"/>
       </w:r>
+      <w:r>
+        <w:rPr>
+          <w:highlight w:val="none"/>
+        </w:rPr>
+      </w:r>
     </w:p>
     <w:p>
       <w:pPr>
@@ -6835,6 +8079,11 @@
           <w:highlight w:val="none"/>
         </w:rPr>
       </w:r>
+      <w:r>
+        <w:rPr>
+          <w:highlight w:val="none"/>
+        </w:rPr>
+      </w:r>
     </w:p>
     <w:p>
       <w:pPr>
@@ -6843,6 +8092,280 @@
         <w:ind/>
         <w:rPr/>
       </w:pPr>
+      <w:r/>
+      <w:r/>
+    </w:p>
+    <w:p>
+      <w:pPr>
+        <w:pBdr/>
+        <w:spacing/>
+        <w:ind/>
+        <w:rPr/>
+      </w:pPr>
+      <w:r>
+        <w:br w:type="page" w:clear="all"/>
+      </w:r>
+      <w:r/>
+      <w:r/>
+    </w:p>
+    <w:p>
+      <w:pPr>
+        <w:pBdr/>
+        <w:spacing/>
+        <w:ind/>
+        <w:rPr/>
+      </w:pPr>
+      <w:r/>
+      <w:r>
+        <mc:AlternateContent>
+          <mc:Choice Requires="wpg">
+            <w:drawing>
+              <wp:anchor xmlns:wp="http://schemas.openxmlformats.org/drawingml/2006/wordprocessingDrawing" xmlns:wp14="http://schemas.microsoft.com/office/word/2010/wordprocessingDrawing" distT="0" distB="0" distL="115200" distR="115200" simplePos="0" relativeHeight="53248" behindDoc="0" locked="0" layoutInCell="1" allowOverlap="1">
+                <wp:simplePos x="0" y="0"/>
+                <wp:positionH relativeFrom="column">
+                  <wp:posOffset>-884850</wp:posOffset>
+                </wp:positionH>
+                <wp:positionV relativeFrom="paragraph">
+                  <wp:posOffset>800100</wp:posOffset>
+                </wp:positionV>
+                <wp:extent cx="7713300" cy="3178505"/>
+                <wp:effectExtent l="0" t="0" r="0" b="0"/>
+                <wp:wrapThrough wrapText="bothSides">
+                  <wp:wrapPolygon edited="1">
+                    <wp:start x="0" y="0"/>
+                    <wp:lineTo x="21600" y="0"/>
+                    <wp:lineTo x="21600" y="21600"/>
+                    <wp:lineTo x="0" y="21600"/>
+                  </wp:wrapPolygon>
+                </wp:wrapThrough>
+                <wp:docPr id="8" name=""/>
+                <wp:cNvGraphicFramePr>
+                  <a:graphicFrameLocks xmlns:a="http://schemas.openxmlformats.org/drawingml/2006/main" noChangeAspect="1"/>
+                </wp:cNvGraphicFramePr>
+                <a:graphic xmlns:a="http://schemas.openxmlformats.org/drawingml/2006/main">
+                  <a:graphicData uri="http://schemas.openxmlformats.org/drawingml/2006/picture">
+                    <pic:pic xmlns:pic="http://schemas.openxmlformats.org/drawingml/2006/picture">
+                      <pic:nvPicPr>
+                        <pic:cNvPr id="1363078831" name=""/>
+                        <pic:cNvPicPr>
+                          <a:picLocks noChangeAspect="1"/>
+                        </pic:cNvPicPr>
+                        <pic:nvPr/>
+                      </pic:nvPicPr>
+                      <pic:blipFill rotWithShape="1">
+                        <a:blip r:embed="rId15"/>
+                        <a:stretch/>
+                      </pic:blipFill>
+                      <pic:spPr bwMode="auto">
+                        <a:xfrm flipH="0" flipV="0">
+                          <a:off x="0" y="0"/>
+                          <a:ext cx="7713299" cy="3178504"/>
+                        </a:xfrm>
+                        <a:prstGeom prst="rect">
+                          <a:avLst/>
+                        </a:prstGeom>
+                      </pic:spPr>
+                    </pic:pic>
+                  </a:graphicData>
+                </a:graphic>
+              </wp:anchor>
+            </w:drawing>
+          </mc:Choice>
+          <mc:Fallback>
+            <w:pict>
+              <v:shapetype id="_x0000_t75" coordsize="21600,21600" o:spt="75" o:preferrelative="t" path="m@4@5l@4@11@9@11@9@5xe" filled="f" stroked="f">
+                <v:stroke joinstyle="miter"/>
+                <v:formulas>
+                  <v:f eqn="if lineDrawn pixelLineWidth 0"/>
+                  <v:f eqn="sum @0 1 0"/>
+                  <v:f eqn="sum 0 0 @1"/>
+                  <v:f eqn="prod @2 1 2"/>
+                  <v:f eqn="prod @3 21600 pixelWidth"/>
+                  <v:f eqn="prod @3 21600 pixelHeight"/>
+                  <v:f eqn="sum @0 0 1"/>
+                  <v:f eqn="prod @6 1 2"/>
+                  <v:f eqn="prod @7 21600 pixelWidth"/>
+                  <v:f eqn="sum @8 21600 0"/>
+                  <v:f eqn="prod @7 21600 pixelHeight"/>
+                  <v:f eqn="sum @10 21600 0"/>
+                </v:formulas>
+                <v:path o:extrusionok="f" gradientshapeok="t" o:connecttype="rect"/>
+                <o:lock v:ext="edit" aspectratio="t"/>
+              </v:shapetype>
+              <v:shape id="_x0000_i7" o:spid="_x0000_s7" type="#_x0000_t75" style="position:absolute;z-index:53248;o:allowoverlap:true;o:allowincell:true;mso-position-horizontal-relative:text;margin-left:-69.67pt;mso-position-horizontal:absolute;mso-position-vertical-relative:text;margin-top:63.00pt;mso-position-vertical:absolute;width:607.35pt;height:250.28pt;mso-wrap-distance-left:9.07pt;mso-wrap-distance-top:0.00pt;mso-wrap-distance-right:9.07pt;mso-wrap-distance-bottom:0.00pt;z-index:1;" wrapcoords="0 0 100000 0 100000 100000 0 100000" stroked="false">
+                <w10:wrap type="through"/>
+                <v:imagedata r:id="rId15" o:title=""/>
+                <o:lock v:ext="edit" rotation="t"/>
+              </v:shape>
+            </w:pict>
+          </mc:Fallback>
+        </mc:AlternateContent>
+      </w:r>
+      <w:r/>
+      <w:r/>
+    </w:p>
+    <w:p>
+      <w:pPr>
+        <w:pBdr/>
+        <w:spacing/>
+        <w:ind/>
+        <w:rPr/>
+      </w:pPr>
+      <w:r/>
+      <w:r/>
+      <w:r/>
+    </w:p>
+    <w:p>
+      <w:pPr>
+        <w:pBdr/>
+        <w:spacing/>
+        <w:ind/>
+        <w:rPr/>
+      </w:pPr>
+      <w:r/>
+      <w:r/>
+      <w:r/>
+    </w:p>
+    <w:p>
+      <w:pPr>
+        <w:pBdr/>
+        <w:spacing/>
+        <w:ind/>
+        <w:rPr/>
+      </w:pPr>
+      <w:r/>
+      <w:r/>
+      <w:r/>
+    </w:p>
+    <w:p>
+      <w:pPr>
+        <w:pBdr/>
+        <w:spacing/>
+        <w:ind/>
+        <w:rPr/>
+      </w:pPr>
+      <w:r/>
+      <w:r/>
+      <w:r/>
+    </w:p>
+    <w:p>
+      <w:pPr>
+        <w:pBdr/>
+        <w:spacing/>
+        <w:ind/>
+        <w:rPr/>
+      </w:pPr>
+      <w:r/>
+      <w:r/>
+    </w:p>
+    <w:p>
+      <w:pPr>
+        <w:pBdr/>
+        <w:spacing/>
+        <w:ind/>
+        <w:rPr/>
+      </w:pPr>
+      <w:r>
+        <w:br w:type="page" w:clear="all"/>
+      </w:r>
+      <w:r/>
+      <w:r/>
+    </w:p>
+    <w:p>
+      <w:pPr>
+        <w:pBdr/>
+        <w:spacing/>
+        <w:ind/>
+        <w:rPr/>
+      </w:pPr>
+      <w:r/>
+      <w:r>
+        <mc:AlternateContent>
+          <mc:Choice Requires="wpg">
+            <w:drawing>
+              <wp:anchor xmlns:wp="http://schemas.openxmlformats.org/drawingml/2006/wordprocessingDrawing" xmlns:wp14="http://schemas.microsoft.com/office/word/2010/wordprocessingDrawing" distT="0" distB="0" distL="115200" distR="115200" simplePos="0" relativeHeight="59392" behindDoc="0" locked="0" layoutInCell="1" allowOverlap="1">
+                <wp:simplePos x="0" y="0"/>
+                <wp:positionH relativeFrom="column">
+                  <wp:posOffset>-880761</wp:posOffset>
+                </wp:positionH>
+                <wp:positionV relativeFrom="paragraph">
+                  <wp:posOffset>104775</wp:posOffset>
+                </wp:positionV>
+                <wp:extent cx="7705121" cy="2538825"/>
+                <wp:effectExtent l="0" t="0" r="0" b="0"/>
+                <wp:wrapThrough wrapText="bothSides">
+                  <wp:wrapPolygon edited="1">
+                    <wp:start x="0" y="0"/>
+                    <wp:lineTo x="21600" y="0"/>
+                    <wp:lineTo x="21600" y="21600"/>
+                    <wp:lineTo x="0" y="21600"/>
+                  </wp:wrapPolygon>
+                </wp:wrapThrough>
+                <wp:docPr id="9" name=""/>
+                <wp:cNvGraphicFramePr>
+                  <a:graphicFrameLocks xmlns:a="http://schemas.openxmlformats.org/drawingml/2006/main" noChangeAspect="1"/>
+                </wp:cNvGraphicFramePr>
+                <a:graphic xmlns:a="http://schemas.openxmlformats.org/drawingml/2006/main">
+                  <a:graphicData uri="http://schemas.openxmlformats.org/drawingml/2006/picture">
+                    <pic:pic xmlns:pic="http://schemas.openxmlformats.org/drawingml/2006/picture">
+                      <pic:nvPicPr>
+                        <pic:cNvPr id="2106191678" name=""/>
+                        <pic:cNvPicPr>
+                          <a:picLocks noChangeAspect="1"/>
+                        </pic:cNvPicPr>
+                        <pic:nvPr/>
+                      </pic:nvPicPr>
+                      <pic:blipFill rotWithShape="1">
+                        <a:blip r:embed="rId16"/>
+                        <a:stretch/>
+                      </pic:blipFill>
+                      <pic:spPr bwMode="auto">
+                        <a:xfrm flipH="0" flipV="0">
+                          <a:off x="0" y="0"/>
+                          <a:ext cx="7705121" cy="2538824"/>
+                        </a:xfrm>
+                        <a:prstGeom prst="rect">
+                          <a:avLst/>
+                        </a:prstGeom>
+                      </pic:spPr>
+                    </pic:pic>
+                  </a:graphicData>
+                </a:graphic>
+              </wp:anchor>
+            </w:drawing>
+          </mc:Choice>
+          <mc:Fallback>
+            <w:pict>
+              <v:shapetype id="_x0000_t75" coordsize="21600,21600" o:spt="75" o:preferrelative="t" path="m@4@5l@4@11@9@11@9@5xe" filled="f" stroked="f">
+                <v:stroke joinstyle="miter"/>
+                <v:formulas>
+                  <v:f eqn="if lineDrawn pixelLineWidth 0"/>
+                  <v:f eqn="sum @0 1 0"/>
+                  <v:f eqn="sum 0 0 @1"/>
+                  <v:f eqn="prod @2 1 2"/>
+                  <v:f eqn="prod @3 21600 pixelWidth"/>
+                  <v:f eqn="prod @3 21600 pixelHeight"/>
+                  <v:f eqn="sum @0 0 1"/>
+                  <v:f eqn="prod @6 1 2"/>
+                  <v:f eqn="prod @7 21600 pixelWidth"/>
+                  <v:f eqn="sum @8 21600 0"/>
+                  <v:f eqn="prod @7 21600 pixelHeight"/>
+                  <v:f eqn="sum @10 21600 0"/>
+                </v:formulas>
+                <v:path o:extrusionok="f" gradientshapeok="t" o:connecttype="rect"/>
+                <o:lock v:ext="edit" aspectratio="t"/>
+              </v:shapetype>
+              <v:shape id="_x0000_i8" o:spid="_x0000_s8" type="#_x0000_t75" style="position:absolute;z-index:59392;o:allowoverlap:true;o:allowincell:true;mso-position-horizontal-relative:text;margin-left:-69.35pt;mso-position-horizontal:absolute;mso-position-vertical-relative:text;margin-top:8.25pt;mso-position-vertical:absolute;width:606.70pt;height:199.91pt;mso-wrap-distance-left:9.07pt;mso-wrap-distance-top:0.00pt;mso-wrap-distance-right:9.07pt;mso-wrap-distance-bottom:0.00pt;z-index:1;" wrapcoords="0 0 100000 0 100000 100000 0 100000" stroked="false">
+                <w10:wrap type="through"/>
+                <v:imagedata r:id="rId16" o:title=""/>
+                <o:lock v:ext="edit" rotation="t"/>
+              </v:shape>
+            </w:pict>
+          </mc:Fallback>
+        </mc:AlternateContent>
+      </w:r>
+      <w:r/>
+      <w:r/>
       <w:r/>
     </w:p>
     <w:sectPr>

</xml_diff>